<commit_message>
fix(analysis): correct test counts, group sizes, and add accessibility options
Fixes identified in code review:
- Methods section: 30 tests -> 24 tests (carrier type excluded)
- Gender callout: 8 females -> 5 females (regional subset)
- Power table: corrected group sizes (Age 47/10, Military 53/4, Position 36/21)
- Combined summary note: "no Position" -> "carrier type excluded"
- Removed carrier type from retention_summary (prevents Inf values)

Quarto best practices (R4DS Ch 28-29):
- Added fig-cap and fig-alt to all 7 figure-producing chunks
- Improves accessibility and documentation

🤖 Generated with [Claude Code](https://claude.com/claude-code)

Co-Authored-By: Claude Opus 4.5 <noreply@anthropic.com>
</commit_message>
<xml_diff>
--- a/output/reports/scripts/analysis/unified_retention_analysis-mod57.docx
+++ b/output/reports/scripts/analysis/unified_retention_analysis-mod57.docx
@@ -405,13 +405,13 @@
           <w:b/>
           <w:bCs/>
         </w:rPr>
-        <w:t xml:space="preserve">General Factor Analysis (30 tests):</w:t>
+        <w:t xml:space="preserve">General Factor Analysis (24 tests):</w:t>
       </w:r>
       <w:r>
         <w:t xml:space="preserve"> </w:t>
       </w:r>
       <w:r>
-        <w:t xml:space="preserve">Benjamini-Hochberg FDR at q = 0.10 applied across all demographic comparisons.</w:t>
+        <w:t xml:space="preserve">Benjamini-Hochberg FDR at q = 0.10 applied across all demographic comparisons (6 factors x 4 demographics; carrier type excluded in regional-only analysis).</w:t>
       </w:r>
     </w:p>
     <w:p>
@@ -2298,6 +2298,14 @@
     </w:tbl>
     <w:p>
       <w:pPr>
+        <w:pStyle w:val="BodyText"/>
+      </w:pPr>
+      <w:r>
+        <w:t xml:space="preserve">Distribution of top-ranked retention factors among regional airline pilots</w:t>
+      </w:r>
+    </w:p>
+    <w:p>
+      <w:pPr>
         <w:pStyle w:val="TableCaption"/>
       </w:pPr>
       <w:r>
@@ -2553,11 +2561,19 @@
         <w:pStyle w:val="BodyText"/>
       </w:pPr>
       <w:r>
+        <w:t xml:space="preserve">Distribution of top-ranked retention factors among regional airline pilots</w:t>
+      </w:r>
+    </w:p>
+    <w:p>
+      <w:pPr>
+        <w:pStyle w:val="CaptionedFigure"/>
+      </w:pPr>
+      <w:r>
         <w:drawing>
           <wp:inline>
             <wp:extent cx="5334000" cy="3200400"/>
             <wp:effectExtent b="0" l="0" r="0" t="0"/>
-            <wp:docPr descr="" title="" id="39" name="Picture"/>
+            <wp:docPr descr="Distribution of top-ranked retention factors among regional airline pilots" title="" id="39" name="Picture"/>
             <a:graphic>
               <a:graphicData uri="http://schemas.openxmlformats.org/drawingml/2006/picture">
                 <pic:pic>
@@ -2593,6 +2609,14 @@
             </a:graphic>
           </wp:inline>
         </w:drawing>
+      </w:r>
+    </w:p>
+    <w:p>
+      <w:pPr>
+        <w:pStyle w:val="ImageCaption"/>
+      </w:pPr>
+      <w:r>
+        <w:t xml:space="preserve">Distribution of top-ranked retention factors among regional airline pilots</w:t>
       </w:r>
     </w:p>
     <w:bookmarkEnd w:id="41"/>
@@ -7291,7 +7315,7 @@
               <w:t xml:space="preserve"> </w:t>
             </w:r>
             <w:r>
-              <w:t xml:space="preserve">With only 8 female respondents, statistical power for detecting gender differences is limited. Results should be interpreted cautiously.</w:t>
+              <w:t xml:space="preserve">With only 5 female respondents in this regional subset, statistical power for detecting gender differences is severely limited. Results should be interpreted with extreme caution.</w:t>
             </w:r>
           </w:p>
           <w:p/>
@@ -9000,46 +9024,6 @@
     </w:p>
     <w:p>
       <w:pPr>
-        <w:pStyle w:val="SourceCode"/>
-      </w:pPr>
-      <w:r>
-        <w:rPr>
-          <w:rStyle w:val="VerbatimChar"/>
-        </w:rPr>
-        <w:t xml:space="preserve">Warning in min(obj$p_raw, na.rm = TRUE): no non-missing arguments to min;</w:t>
-      </w:r>
-      <w:r>
-        <w:br/>
-      </w:r>
-      <w:r>
-        <w:rPr>
-          <w:rStyle w:val="VerbatimChar"/>
-        </w:rPr>
-        <w:t xml:space="preserve">returning Inf</w:t>
-      </w:r>
-    </w:p>
-    <w:p>
-      <w:pPr>
-        <w:pStyle w:val="SourceCode"/>
-      </w:pPr>
-      <w:r>
-        <w:rPr>
-          <w:rStyle w:val="VerbatimChar"/>
-        </w:rPr>
-        <w:t xml:space="preserve">Warning in min(obj$p_adj_fdr, na.rm = TRUE): no non-missing arguments to min;</w:t>
-      </w:r>
-      <w:r>
-        <w:br/>
-      </w:r>
-      <w:r>
-        <w:rPr>
-          <w:rStyle w:val="VerbatimChar"/>
-        </w:rPr>
-        <w:t xml:space="preserve">returning Inf</w:t>
-      </w:r>
-    </w:p>
-    <w:p>
-      <w:pPr>
         <w:pStyle w:val="TableCaption"/>
       </w:pPr>
       <w:r>
@@ -9419,68 +9403,6 @@
             </w:pPr>
             <w:r>
               <w:t xml:space="preserve">0.2400</w:t>
-            </w:r>
-          </w:p>
-        </w:tc>
-        <w:tc>
-          <w:tcPr/>
-          <w:p>
-            <w:pPr>
-              <w:pStyle w:val="Compact"/>
-              <w:jc w:val="right"/>
-            </w:pPr>
-            <w:r>
-              <w:t xml:space="preserve">0</w:t>
-            </w:r>
-          </w:p>
-        </w:tc>
-      </w:tr>
-      <w:tr>
-        <w:tc>
-          <w:tcPr/>
-          <w:p>
-            <w:pPr>
-              <w:pStyle w:val="Compact"/>
-              <w:jc w:val="left"/>
-            </w:pPr>
-            <w:r>
-              <w:t xml:space="preserve">Carrier Type</w:t>
-            </w:r>
-          </w:p>
-        </w:tc>
-        <w:tc>
-          <w:tcPr/>
-          <w:p>
-            <w:pPr>
-              <w:pStyle w:val="Compact"/>
-              <w:jc w:val="right"/>
-            </w:pPr>
-            <w:r>
-              <w:t xml:space="preserve">0</w:t>
-            </w:r>
-          </w:p>
-        </w:tc>
-        <w:tc>
-          <w:tcPr/>
-          <w:p>
-            <w:pPr>
-              <w:pStyle w:val="Compact"/>
-              <w:jc w:val="right"/>
-            </w:pPr>
-            <w:r>
-              <w:t xml:space="preserve">Inf</w:t>
-            </w:r>
-          </w:p>
-        </w:tc>
-        <w:tc>
-          <w:tcPr/>
-          <w:p>
-            <w:pPr>
-              <w:pStyle w:val="Compact"/>
-              <w:jc w:val="right"/>
-            </w:pPr>
-            <w:r>
-              <w:t xml:space="preserve">Inf</w:t>
             </w:r>
           </w:p>
         </w:tc>
@@ -10121,6 +10043,14 @@
     </w:tbl>
     <w:p>
       <w:pPr>
+        <w:pStyle w:val="BodyText"/>
+      </w:pPr>
+      <w:r>
+        <w:t xml:space="preserve">Median ranks for Financial subfactors</w:t>
+      </w:r>
+    </w:p>
+    <w:p>
+      <w:pPr>
         <w:pStyle w:val="TableCaption"/>
       </w:pPr>
       <w:r>
@@ -10299,11 +10229,19 @@
         <w:pStyle w:val="BodyText"/>
       </w:pPr>
       <w:r>
+        <w:t xml:space="preserve">Median ranks for Financial subfactors</w:t>
+      </w:r>
+    </w:p>
+    <w:p>
+      <w:pPr>
+        <w:pStyle w:val="CaptionedFigure"/>
+      </w:pPr>
+      <w:r>
         <w:drawing>
           <wp:inline>
             <wp:extent cx="5334000" cy="3200400"/>
             <wp:effectExtent b="0" l="0" r="0" t="0"/>
-            <wp:docPr descr="" title="" id="57" name="Picture"/>
+            <wp:docPr descr="Median ranks for Financial subfactors" title="" id="57" name="Picture"/>
             <a:graphic>
               <a:graphicData uri="http://schemas.openxmlformats.org/drawingml/2006/picture">
                 <pic:pic>
@@ -10343,6 +10281,14 @@
     </w:p>
     <w:p>
       <w:pPr>
+        <w:pStyle w:val="ImageCaption"/>
+      </w:pPr>
+      <w:r>
+        <w:t xml:space="preserve">Median ranks for Financial subfactors</w:t>
+      </w:r>
+    </w:p>
+    <w:p>
+      <w:pPr>
         <w:pStyle w:val="TableCaption"/>
       </w:pPr>
       <w:r>
@@ -10972,6 +10918,14 @@
         </w:tc>
       </w:tr>
     </w:tbl>
+    <w:p>
+      <w:pPr>
+        <w:pStyle w:val="BodyText"/>
+      </w:pPr>
+      <w:r>
+        <w:t xml:space="preserve">Median ranks for Financial subfactors</w:t>
+      </w:r>
+    </w:p>
     <w:p>
       <w:pPr>
         <w:pStyle w:val="TableCaption"/>
@@ -11605,6 +11559,14 @@
     </w:tbl>
     <w:p>
       <w:pPr>
+        <w:pStyle w:val="BodyText"/>
+      </w:pPr>
+      <w:r>
+        <w:t xml:space="preserve">Median ranks for Financial subfactors</w:t>
+      </w:r>
+    </w:p>
+    <w:p>
+      <w:pPr>
         <w:pStyle w:val="TableCaption"/>
       </w:pPr>
       <w:r>
@@ -12234,6 +12196,14 @@
         </w:tc>
       </w:tr>
     </w:tbl>
+    <w:p>
+      <w:pPr>
+        <w:pStyle w:val="BodyText"/>
+      </w:pPr>
+      <w:r>
+        <w:t xml:space="preserve">Median ranks for Financial subfactors</w:t>
+      </w:r>
+    </w:p>
     <w:p>
       <w:pPr>
         <w:pStyle w:val="TableCaption"/>
@@ -12865,6 +12835,14 @@
         </w:tc>
       </w:tr>
     </w:tbl>
+    <w:p>
+      <w:pPr>
+        <w:pStyle w:val="BodyText"/>
+      </w:pPr>
+      <w:r>
+        <w:t xml:space="preserve">Median ranks for Financial subfactors</w:t>
+      </w:r>
+    </w:p>
     <w:p>
       <w:pPr>
         <w:pStyle w:val="TableCaption"/>
@@ -13581,6 +13559,14 @@
         </w:tc>
       </w:tr>
     </w:tbl>
+    <w:p>
+      <w:pPr>
+        <w:pStyle w:val="BodyText"/>
+      </w:pPr>
+      <w:r>
+        <w:t xml:space="preserve">Median ranks for Financial subfactors</w:t>
+      </w:r>
+    </w:p>
     <w:bookmarkEnd w:id="59"/>
     <w:bookmarkStart w:id="63" w:name="quality-of-life-subfactors"/>
     <w:p>
@@ -14138,6 +14124,14 @@
     </w:tbl>
     <w:p>
       <w:pPr>
+        <w:pStyle w:val="BodyText"/>
+      </w:pPr>
+      <w:r>
+        <w:t xml:space="preserve">Median ranks for Quality of Life subfactors</w:t>
+      </w:r>
+    </w:p>
+    <w:p>
+      <w:pPr>
         <w:pStyle w:val="TableCaption"/>
       </w:pPr>
       <w:r>
@@ -14316,11 +14310,19 @@
         <w:pStyle w:val="BodyText"/>
       </w:pPr>
       <w:r>
+        <w:t xml:space="preserve">Median ranks for Quality of Life subfactors</w:t>
+      </w:r>
+    </w:p>
+    <w:p>
+      <w:pPr>
+        <w:pStyle w:val="CaptionedFigure"/>
+      </w:pPr>
+      <w:r>
         <w:drawing>
           <wp:inline>
             <wp:extent cx="5334000" cy="3200400"/>
             <wp:effectExtent b="0" l="0" r="0" t="0"/>
-            <wp:docPr descr="" title="" id="61" name="Picture"/>
+            <wp:docPr descr="Median ranks for Quality of Life subfactors" title="" id="61" name="Picture"/>
             <a:graphic>
               <a:graphicData uri="http://schemas.openxmlformats.org/drawingml/2006/picture">
                 <pic:pic>
@@ -14360,6 +14362,14 @@
     </w:p>
     <w:p>
       <w:pPr>
+        <w:pStyle w:val="ImageCaption"/>
+      </w:pPr>
+      <w:r>
+        <w:t xml:space="preserve">Median ranks for Quality of Life subfactors</w:t>
+      </w:r>
+    </w:p>
+    <w:p>
+      <w:pPr>
         <w:pStyle w:val="TableCaption"/>
       </w:pPr>
       <w:r>
@@ -14989,6 +14999,14 @@
         </w:tc>
       </w:tr>
     </w:tbl>
+    <w:p>
+      <w:pPr>
+        <w:pStyle w:val="BodyText"/>
+      </w:pPr>
+      <w:r>
+        <w:t xml:space="preserve">Median ranks for Quality of Life subfactors</w:t>
+      </w:r>
+    </w:p>
     <w:p>
       <w:pPr>
         <w:pStyle w:val="TableCaption"/>
@@ -15622,6 +15640,14 @@
     </w:tbl>
     <w:p>
       <w:pPr>
+        <w:pStyle w:val="BodyText"/>
+      </w:pPr>
+      <w:r>
+        <w:t xml:space="preserve">Median ranks for Quality of Life subfactors</w:t>
+      </w:r>
+    </w:p>
+    <w:p>
+      <w:pPr>
         <w:pStyle w:val="TableCaption"/>
       </w:pPr>
       <w:r>
@@ -16251,6 +16277,14 @@
         </w:tc>
       </w:tr>
     </w:tbl>
+    <w:p>
+      <w:pPr>
+        <w:pStyle w:val="BodyText"/>
+      </w:pPr>
+      <w:r>
+        <w:t xml:space="preserve">Median ranks for Quality of Life subfactors</w:t>
+      </w:r>
+    </w:p>
     <w:p>
       <w:pPr>
         <w:pStyle w:val="TableCaption"/>
@@ -16882,6 +16916,14 @@
         </w:tc>
       </w:tr>
     </w:tbl>
+    <w:p>
+      <w:pPr>
+        <w:pStyle w:val="BodyText"/>
+      </w:pPr>
+      <w:r>
+        <w:t xml:space="preserve">Median ranks for Quality of Life subfactors</w:t>
+      </w:r>
+    </w:p>
     <w:p>
       <w:pPr>
         <w:pStyle w:val="TableCaption"/>
@@ -17598,6 +17640,14 @@
         </w:tc>
       </w:tr>
     </w:tbl>
+    <w:p>
+      <w:pPr>
+        <w:pStyle w:val="BodyText"/>
+      </w:pPr>
+      <w:r>
+        <w:t xml:space="preserve">Median ranks for Quality of Life subfactors</w:t>
+      </w:r>
+    </w:p>
     <w:bookmarkEnd w:id="63"/>
     <w:bookmarkStart w:id="67" w:name="professional-opportunity-subfactors"/>
     <w:p>
@@ -18081,6 +18131,14 @@
     </w:tbl>
     <w:p>
       <w:pPr>
+        <w:pStyle w:val="BodyText"/>
+      </w:pPr>
+      <w:r>
+        <w:t xml:space="preserve">Median ranks for Professional Opportunity subfactors</w:t>
+      </w:r>
+    </w:p>
+    <w:p>
+      <w:pPr>
         <w:pStyle w:val="TableCaption"/>
       </w:pPr>
       <w:r>
@@ -18259,11 +18317,19 @@
         <w:pStyle w:val="BodyText"/>
       </w:pPr>
       <w:r>
+        <w:t xml:space="preserve">Median ranks for Professional Opportunity subfactors</w:t>
+      </w:r>
+    </w:p>
+    <w:p>
+      <w:pPr>
+        <w:pStyle w:val="CaptionedFigure"/>
+      </w:pPr>
+      <w:r>
         <w:drawing>
           <wp:inline>
             <wp:extent cx="5334000" cy="3200400"/>
             <wp:effectExtent b="0" l="0" r="0" t="0"/>
-            <wp:docPr descr="" title="" id="65" name="Picture"/>
+            <wp:docPr descr="Median ranks for Professional Opportunity subfactors" title="" id="65" name="Picture"/>
             <a:graphic>
               <a:graphicData uri="http://schemas.openxmlformats.org/drawingml/2006/picture">
                 <pic:pic>
@@ -18303,6 +18369,14 @@
     </w:p>
     <w:p>
       <w:pPr>
+        <w:pStyle w:val="ImageCaption"/>
+      </w:pPr>
+      <w:r>
+        <w:t xml:space="preserve">Median ranks for Professional Opportunity subfactors</w:t>
+      </w:r>
+    </w:p>
+    <w:p>
+      <w:pPr>
         <w:pStyle w:val="TableCaption"/>
       </w:pPr>
       <w:r>
@@ -18846,6 +18920,14 @@
         </w:tc>
       </w:tr>
     </w:tbl>
+    <w:p>
+      <w:pPr>
+        <w:pStyle w:val="BodyText"/>
+      </w:pPr>
+      <w:r>
+        <w:t xml:space="preserve">Median ranks for Professional Opportunity subfactors</w:t>
+      </w:r>
+    </w:p>
     <w:p>
       <w:pPr>
         <w:pStyle w:val="TableCaption"/>
@@ -19393,6 +19475,14 @@
     </w:tbl>
     <w:p>
       <w:pPr>
+        <w:pStyle w:val="BodyText"/>
+      </w:pPr>
+      <w:r>
+        <w:t xml:space="preserve">Median ranks for Professional Opportunity subfactors</w:t>
+      </w:r>
+    </w:p>
+    <w:p>
+      <w:pPr>
         <w:pStyle w:val="TableCaption"/>
       </w:pPr>
       <w:r>
@@ -19936,6 +20026,14 @@
         </w:tc>
       </w:tr>
     </w:tbl>
+    <w:p>
+      <w:pPr>
+        <w:pStyle w:val="BodyText"/>
+      </w:pPr>
+      <w:r>
+        <w:t xml:space="preserve">Median ranks for Professional Opportunity subfactors</w:t>
+      </w:r>
+    </w:p>
     <w:p>
       <w:pPr>
         <w:pStyle w:val="TableCaption"/>
@@ -20481,6 +20579,14 @@
         </w:tc>
       </w:tr>
     </w:tbl>
+    <w:p>
+      <w:pPr>
+        <w:pStyle w:val="BodyText"/>
+      </w:pPr>
+      <w:r>
+        <w:t xml:space="preserve">Median ranks for Professional Opportunity subfactors</w:t>
+      </w:r>
+    </w:p>
     <w:p>
       <w:pPr>
         <w:pStyle w:val="TableCaption"/>
@@ -21099,6 +21205,14 @@
         </w:tc>
       </w:tr>
     </w:tbl>
+    <w:p>
+      <w:pPr>
+        <w:pStyle w:val="BodyText"/>
+      </w:pPr>
+      <w:r>
+        <w:t xml:space="preserve">Median ranks for Professional Opportunity subfactors</w:t>
+      </w:r>
+    </w:p>
     <w:bookmarkEnd w:id="67"/>
     <w:bookmarkStart w:id="71" w:name="recognition-subfactors"/>
     <w:p>
@@ -21509,6 +21623,14 @@
     </w:tbl>
     <w:p>
       <w:pPr>
+        <w:pStyle w:val="BodyText"/>
+      </w:pPr>
+      <w:r>
+        <w:t xml:space="preserve">Median ranks for Recognition subfactors</w:t>
+      </w:r>
+    </w:p>
+    <w:p>
+      <w:pPr>
         <w:pStyle w:val="TableCaption"/>
       </w:pPr>
       <w:r>
@@ -21687,11 +21809,19 @@
         <w:pStyle w:val="BodyText"/>
       </w:pPr>
       <w:r>
+        <w:t xml:space="preserve">Median ranks for Recognition subfactors</w:t>
+      </w:r>
+    </w:p>
+    <w:p>
+      <w:pPr>
+        <w:pStyle w:val="CaptionedFigure"/>
+      </w:pPr>
+      <w:r>
         <w:drawing>
           <wp:inline>
             <wp:extent cx="5334000" cy="3200400"/>
             <wp:effectExtent b="0" l="0" r="0" t="0"/>
-            <wp:docPr descr="" title="" id="69" name="Picture"/>
+            <wp:docPr descr="Median ranks for Recognition subfactors" title="" id="69" name="Picture"/>
             <a:graphic>
               <a:graphicData uri="http://schemas.openxmlformats.org/drawingml/2006/picture">
                 <pic:pic>
@@ -21731,6 +21861,14 @@
     </w:p>
     <w:p>
       <w:pPr>
+        <w:pStyle w:val="ImageCaption"/>
+      </w:pPr>
+      <w:r>
+        <w:t xml:space="preserve">Median ranks for Recognition subfactors</w:t>
+      </w:r>
+    </w:p>
+    <w:p>
+      <w:pPr>
         <w:pStyle w:val="TableCaption"/>
       </w:pPr>
       <w:r>
@@ -22188,6 +22326,14 @@
         </w:tc>
       </w:tr>
     </w:tbl>
+    <w:p>
+      <w:pPr>
+        <w:pStyle w:val="BodyText"/>
+      </w:pPr>
+      <w:r>
+        <w:t xml:space="preserve">Median ranks for Recognition subfactors</w:t>
+      </w:r>
+    </w:p>
     <w:p>
       <w:pPr>
         <w:pStyle w:val="TableCaption"/>
@@ -22649,6 +22795,14 @@
     </w:tbl>
     <w:p>
       <w:pPr>
+        <w:pStyle w:val="BodyText"/>
+      </w:pPr>
+      <w:r>
+        <w:t xml:space="preserve">Median ranks for Recognition subfactors</w:t>
+      </w:r>
+    </w:p>
+    <w:p>
+      <w:pPr>
         <w:pStyle w:val="TableCaption"/>
       </w:pPr>
       <w:r>
@@ -23106,6 +23260,14 @@
         </w:tc>
       </w:tr>
     </w:tbl>
+    <w:p>
+      <w:pPr>
+        <w:pStyle w:val="BodyText"/>
+      </w:pPr>
+      <w:r>
+        <w:t xml:space="preserve">Median ranks for Recognition subfactors</w:t>
+      </w:r>
+    </w:p>
     <w:p>
       <w:pPr>
         <w:pStyle w:val="TableCaption"/>
@@ -23565,6 +23727,14 @@
         </w:tc>
       </w:tr>
     </w:tbl>
+    <w:p>
+      <w:pPr>
+        <w:pStyle w:val="BodyText"/>
+      </w:pPr>
+      <w:r>
+        <w:t xml:space="preserve">Median ranks for Recognition subfactors</w:t>
+      </w:r>
+    </w:p>
     <w:p>
       <w:pPr>
         <w:pStyle w:val="TableCaption"/>
@@ -24085,6 +24255,14 @@
         </w:tc>
       </w:tr>
     </w:tbl>
+    <w:p>
+      <w:pPr>
+        <w:pStyle w:val="BodyText"/>
+      </w:pPr>
+      <w:r>
+        <w:t xml:space="preserve">Median ranks for Recognition subfactors</w:t>
+      </w:r>
+    </w:p>
     <w:bookmarkEnd w:id="71"/>
     <w:bookmarkStart w:id="75" w:name="schedule-subfactors"/>
     <w:p>
@@ -24568,6 +24746,14 @@
     </w:tbl>
     <w:p>
       <w:pPr>
+        <w:pStyle w:val="BodyText"/>
+      </w:pPr>
+      <w:r>
+        <w:t xml:space="preserve">Median ranks for Schedule subfactors</w:t>
+      </w:r>
+    </w:p>
+    <w:p>
+      <w:pPr>
         <w:pStyle w:val="TableCaption"/>
       </w:pPr>
       <w:r>
@@ -24746,11 +24932,19 @@
         <w:pStyle w:val="BodyText"/>
       </w:pPr>
       <w:r>
+        <w:t xml:space="preserve">Median ranks for Schedule subfactors</w:t>
+      </w:r>
+    </w:p>
+    <w:p>
+      <w:pPr>
+        <w:pStyle w:val="CaptionedFigure"/>
+      </w:pPr>
+      <w:r>
         <w:drawing>
           <wp:inline>
             <wp:extent cx="5334000" cy="3200400"/>
             <wp:effectExtent b="0" l="0" r="0" t="0"/>
-            <wp:docPr descr="" title="" id="73" name="Picture"/>
+            <wp:docPr descr="Median ranks for Schedule subfactors" title="" id="73" name="Picture"/>
             <a:graphic>
               <a:graphicData uri="http://schemas.openxmlformats.org/drawingml/2006/picture">
                 <pic:pic>
@@ -24790,6 +24984,14 @@
     </w:p>
     <w:p>
       <w:pPr>
+        <w:pStyle w:val="ImageCaption"/>
+      </w:pPr>
+      <w:r>
+        <w:t xml:space="preserve">Median ranks for Schedule subfactors</w:t>
+      </w:r>
+    </w:p>
+    <w:p>
+      <w:pPr>
         <w:pStyle w:val="TableCaption"/>
       </w:pPr>
       <w:r>
@@ -25333,6 +25535,14 @@
         </w:tc>
       </w:tr>
     </w:tbl>
+    <w:p>
+      <w:pPr>
+        <w:pStyle w:val="BodyText"/>
+      </w:pPr>
+      <w:r>
+        <w:t xml:space="preserve">Median ranks for Schedule subfactors</w:t>
+      </w:r>
+    </w:p>
     <w:p>
       <w:pPr>
         <w:pStyle w:val="TableCaption"/>
@@ -25880,6 +26090,14 @@
     </w:tbl>
     <w:p>
       <w:pPr>
+        <w:pStyle w:val="BodyText"/>
+      </w:pPr>
+      <w:r>
+        <w:t xml:space="preserve">Median ranks for Schedule subfactors</w:t>
+      </w:r>
+    </w:p>
+    <w:p>
+      <w:pPr>
         <w:pStyle w:val="TableCaption"/>
       </w:pPr>
       <w:r>
@@ -26423,6 +26641,14 @@
         </w:tc>
       </w:tr>
     </w:tbl>
+    <w:p>
+      <w:pPr>
+        <w:pStyle w:val="BodyText"/>
+      </w:pPr>
+      <w:r>
+        <w:t xml:space="preserve">Median ranks for Schedule subfactors</w:t>
+      </w:r>
+    </w:p>
     <w:p>
       <w:pPr>
         <w:pStyle w:val="TableCaption"/>
@@ -26968,6 +27194,14 @@
         </w:tc>
       </w:tr>
     </w:tbl>
+    <w:p>
+      <w:pPr>
+        <w:pStyle w:val="BodyText"/>
+      </w:pPr>
+      <w:r>
+        <w:t xml:space="preserve">Median ranks for Schedule subfactors</w:t>
+      </w:r>
+    </w:p>
     <w:p>
       <w:pPr>
         <w:pStyle w:val="TableCaption"/>
@@ -27586,6 +27820,14 @@
         </w:tc>
       </w:tr>
     </w:tbl>
+    <w:p>
+      <w:pPr>
+        <w:pStyle w:val="BodyText"/>
+      </w:pPr>
+      <w:r>
+        <w:t xml:space="preserve">Median ranks for Schedule subfactors</w:t>
+      </w:r>
+    </w:p>
     <w:bookmarkEnd w:id="75"/>
     <w:bookmarkStart w:id="79" w:name="operational-subfactors"/>
     <w:p>
@@ -28069,6 +28311,14 @@
     </w:tbl>
     <w:p>
       <w:pPr>
+        <w:pStyle w:val="BodyText"/>
+      </w:pPr>
+      <w:r>
+        <w:t xml:space="preserve">Median ranks for Operational subfactors</w:t>
+      </w:r>
+    </w:p>
+    <w:p>
+      <w:pPr>
         <w:pStyle w:val="TableCaption"/>
       </w:pPr>
       <w:r>
@@ -28247,11 +28497,19 @@
         <w:pStyle w:val="BodyText"/>
       </w:pPr>
       <w:r>
+        <w:t xml:space="preserve">Median ranks for Operational subfactors</w:t>
+      </w:r>
+    </w:p>
+    <w:p>
+      <w:pPr>
+        <w:pStyle w:val="CaptionedFigure"/>
+      </w:pPr>
+      <w:r>
         <w:drawing>
           <wp:inline>
             <wp:extent cx="5334000" cy="3200400"/>
             <wp:effectExtent b="0" l="0" r="0" t="0"/>
-            <wp:docPr descr="" title="" id="77" name="Picture"/>
+            <wp:docPr descr="Median ranks for Operational subfactors" title="" id="77" name="Picture"/>
             <a:graphic>
               <a:graphicData uri="http://schemas.openxmlformats.org/drawingml/2006/picture">
                 <pic:pic>
@@ -28291,6 +28549,14 @@
     </w:p>
     <w:p>
       <w:pPr>
+        <w:pStyle w:val="ImageCaption"/>
+      </w:pPr>
+      <w:r>
+        <w:t xml:space="preserve">Median ranks for Operational subfactors</w:t>
+      </w:r>
+    </w:p>
+    <w:p>
+      <w:pPr>
         <w:pStyle w:val="TableCaption"/>
       </w:pPr>
       <w:r>
@@ -28834,6 +29100,14 @@
         </w:tc>
       </w:tr>
     </w:tbl>
+    <w:p>
+      <w:pPr>
+        <w:pStyle w:val="BodyText"/>
+      </w:pPr>
+      <w:r>
+        <w:t xml:space="preserve">Median ranks for Operational subfactors</w:t>
+      </w:r>
+    </w:p>
     <w:p>
       <w:pPr>
         <w:pStyle w:val="TableCaption"/>
@@ -29381,6 +29655,14 @@
     </w:tbl>
     <w:p>
       <w:pPr>
+        <w:pStyle w:val="BodyText"/>
+      </w:pPr>
+      <w:r>
+        <w:t xml:space="preserve">Median ranks for Operational subfactors</w:t>
+      </w:r>
+    </w:p>
+    <w:p>
+      <w:pPr>
         <w:pStyle w:val="TableCaption"/>
       </w:pPr>
       <w:r>
@@ -29924,6 +30206,14 @@
         </w:tc>
       </w:tr>
     </w:tbl>
+    <w:p>
+      <w:pPr>
+        <w:pStyle w:val="BodyText"/>
+      </w:pPr>
+      <w:r>
+        <w:t xml:space="preserve">Median ranks for Operational subfactors</w:t>
+      </w:r>
+    </w:p>
     <w:p>
       <w:pPr>
         <w:pStyle w:val="TableCaption"/>
@@ -30469,6 +30759,14 @@
         </w:tc>
       </w:tr>
     </w:tbl>
+    <w:p>
+      <w:pPr>
+        <w:pStyle w:val="BodyText"/>
+      </w:pPr>
+      <w:r>
+        <w:t xml:space="preserve">Median ranks for Operational subfactors</w:t>
+      </w:r>
+    </w:p>
     <w:p>
       <w:pPr>
         <w:pStyle w:val="TableCaption"/>
@@ -31087,6 +31385,14 @@
         </w:tc>
       </w:tr>
     </w:tbl>
+    <w:p>
+      <w:pPr>
+        <w:pStyle w:val="BodyText"/>
+      </w:pPr>
+      <w:r>
+        <w:t xml:space="preserve">Median ranks for Operational subfactors</w:t>
+      </w:r>
+    </w:p>
     <w:bookmarkEnd w:id="79"/>
     <w:bookmarkStart w:id="82" w:name="hierarchical-fdr-screening-results"/>
     <w:p>
@@ -31896,11 +32202,11 @@
         <w:tblCaption w:val="Combined Analysis Summary: Multiple Testing Approach"/>
       </w:tblPr>
       <w:tblGrid>
-        <w:gridCol w:w="1090"/>
-        <w:gridCol w:w="688"/>
-        <w:gridCol w:w="2353"/>
-        <w:gridCol w:w="918"/>
-        <w:gridCol w:w="2869"/>
+        <w:gridCol w:w="1082"/>
+        <w:gridCol w:w="683"/>
+        <w:gridCol w:w="2336"/>
+        <w:gridCol w:w="911"/>
+        <w:gridCol w:w="2905"/>
       </w:tblGrid>
       <w:tr>
         <w:trPr>
@@ -32024,7 +32330,7 @@
               <w:jc w:val="left"/>
             </w:pPr>
             <w:r>
-              <w:t xml:space="preserve">6 factors × 5 demographics (no Position analysis)</w:t>
+              <w:t xml:space="preserve">6 factors x 4 demographics (carrier type excluded)</w:t>
             </w:r>
           </w:p>
         </w:tc>
@@ -32515,49 +32821,232 @@
       <w:r>
         <w:t xml:space="preserve">The regional-only sample of n = 57 provides adequate power only for detecting large effects. For demographic comparisons:</w:t>
       </w:r>
-      <w:r>
-        <w:t xml:space="preserve"> </w:t>
-      </w:r>
-      <w:r>
-        <w:t xml:space="preserve">| Comparison | Approximate Group Sizes | Detectable Effect (80% power) |</w:t>
-      </w:r>
-      <w:r>
-        <w:t xml:space="preserve"> </w:t>
-      </w:r>
-      <w:r>
-        <w:t xml:space="preserve">|————|————————|——————————-|</w:t>
-      </w:r>
-      <w:r>
-        <w:t xml:space="preserve"> </w:t>
-      </w:r>
-      <w:r>
-        <w:t xml:space="preserve">| Age groups | ~43 vs ~14 | Large (r &gt; 0.45) |</w:t>
-      </w:r>
-      <w:r>
-        <w:t xml:space="preserve"> </w:t>
-      </w:r>
-      <w:r>
-        <w:t xml:space="preserve">| Experience | ~14 per quartile | Very large (eta-squared &gt; 0.14) |</w:t>
-      </w:r>
-      <w:r>
-        <w:t xml:space="preserve"> </w:t>
-      </w:r>
-      <w:r>
-        <w:t xml:space="preserve">| Gender | ~52 vs ~5 | Very large only (r &gt; 0.7) |</w:t>
-      </w:r>
-      <w:r>
-        <w:t xml:space="preserve"> </w:t>
-      </w:r>
-      <w:r>
-        <w:t xml:space="preserve">| Military | ~25 vs ~32 | Medium-large (r approx 0.40) |</w:t>
-      </w:r>
-      <w:r>
-        <w:t xml:space="preserve"> </w:t>
-      </w:r>
-      <w:r>
-        <w:t xml:space="preserve">| Position | ~33 vs ~24 | Medium-large (r approx 0.40) |</w:t>
-      </w:r>
     </w:p>
+    <w:tbl>
+      <w:tblPr>
+        <w:tblStyle w:val="Table"/>
+        <w:tblW w:type="auto" w:w="0"/>
+        <w:tblLook w:firstRow="1" w:lastRow="0" w:firstColumn="0" w:lastColumn="0" w:noHBand="0" w:noVBand="0" w:val="0020"/>
+      </w:tblPr>
+      <w:tblGrid>
+        <w:gridCol w:w="2640"/>
+        <w:gridCol w:w="2640"/>
+        <w:gridCol w:w="2640"/>
+      </w:tblGrid>
+      <w:tr>
+        <w:trPr>
+          <w:tblHeader w:val="on"/>
+        </w:trPr>
+        <w:tc>
+          <w:tcPr/>
+          <w:p>
+            <w:pPr>
+              <w:pStyle w:val="Compact"/>
+            </w:pPr>
+            <w:r>
+              <w:t xml:space="preserve">Comparison</w:t>
+            </w:r>
+          </w:p>
+        </w:tc>
+        <w:tc>
+          <w:tcPr/>
+          <w:p>
+            <w:pPr>
+              <w:pStyle w:val="Compact"/>
+            </w:pPr>
+            <w:r>
+              <w:t xml:space="preserve">Group Sizes</w:t>
+            </w:r>
+          </w:p>
+        </w:tc>
+        <w:tc>
+          <w:tcPr/>
+          <w:p>
+            <w:pPr>
+              <w:pStyle w:val="Compact"/>
+            </w:pPr>
+            <w:r>
+              <w:t xml:space="preserve">Detectable Effect (80% power)</w:t>
+            </w:r>
+          </w:p>
+        </w:tc>
+      </w:tr>
+      <w:tr>
+        <w:tc>
+          <w:tcPr/>
+          <w:p>
+            <w:pPr>
+              <w:pStyle w:val="Compact"/>
+            </w:pPr>
+            <w:r>
+              <w:t xml:space="preserve">Age groups</w:t>
+            </w:r>
+          </w:p>
+        </w:tc>
+        <w:tc>
+          <w:tcPr/>
+          <w:p>
+            <w:pPr>
+              <w:pStyle w:val="Compact"/>
+            </w:pPr>
+            <w:r>
+              <w:t xml:space="preserve">47 vs 10</w:t>
+            </w:r>
+          </w:p>
+        </w:tc>
+        <w:tc>
+          <w:tcPr/>
+          <w:p>
+            <w:pPr>
+              <w:pStyle w:val="Compact"/>
+            </w:pPr>
+            <w:r>
+              <w:t xml:space="preserve">Large (r &gt; 0.50)</w:t>
+            </w:r>
+          </w:p>
+        </w:tc>
+      </w:tr>
+      <w:tr>
+        <w:tc>
+          <w:tcPr/>
+          <w:p>
+            <w:pPr>
+              <w:pStyle w:val="Compact"/>
+            </w:pPr>
+            <w:r>
+              <w:t xml:space="preserve">Experience</w:t>
+            </w:r>
+          </w:p>
+        </w:tc>
+        <w:tc>
+          <w:tcPr/>
+          <w:p>
+            <w:pPr>
+              <w:pStyle w:val="Compact"/>
+            </w:pPr>
+            <w:r>
+              <w:t xml:space="preserve">~14 per quartile</w:t>
+            </w:r>
+          </w:p>
+        </w:tc>
+        <w:tc>
+          <w:tcPr/>
+          <w:p>
+            <w:pPr>
+              <w:pStyle w:val="Compact"/>
+            </w:pPr>
+            <w:r>
+              <w:t xml:space="preserve">Very large (eta-squared &gt; 0.14)</w:t>
+            </w:r>
+          </w:p>
+        </w:tc>
+      </w:tr>
+      <w:tr>
+        <w:tc>
+          <w:tcPr/>
+          <w:p>
+            <w:pPr>
+              <w:pStyle w:val="Compact"/>
+            </w:pPr>
+            <w:r>
+              <w:t xml:space="preserve">Gender</w:t>
+            </w:r>
+          </w:p>
+        </w:tc>
+        <w:tc>
+          <w:tcPr/>
+          <w:p>
+            <w:pPr>
+              <w:pStyle w:val="Compact"/>
+            </w:pPr>
+            <w:r>
+              <w:t xml:space="preserve">51 vs 5</w:t>
+            </w:r>
+          </w:p>
+        </w:tc>
+        <w:tc>
+          <w:tcPr/>
+          <w:p>
+            <w:pPr>
+              <w:pStyle w:val="Compact"/>
+            </w:pPr>
+            <w:r>
+              <w:t xml:space="preserve">Very large only (r &gt; 0.70)</w:t>
+            </w:r>
+          </w:p>
+        </w:tc>
+      </w:tr>
+      <w:tr>
+        <w:tc>
+          <w:tcPr/>
+          <w:p>
+            <w:pPr>
+              <w:pStyle w:val="Compact"/>
+            </w:pPr>
+            <w:r>
+              <w:t xml:space="preserve">Military</w:t>
+            </w:r>
+          </w:p>
+        </w:tc>
+        <w:tc>
+          <w:tcPr/>
+          <w:p>
+            <w:pPr>
+              <w:pStyle w:val="Compact"/>
+            </w:pPr>
+            <w:r>
+              <w:t xml:space="preserve">53 vs 4</w:t>
+            </w:r>
+          </w:p>
+        </w:tc>
+        <w:tc>
+          <w:tcPr/>
+          <w:p>
+            <w:pPr>
+              <w:pStyle w:val="Compact"/>
+            </w:pPr>
+            <w:r>
+              <w:t xml:space="preserve">Very large only (r &gt; 0.70)</w:t>
+            </w:r>
+          </w:p>
+        </w:tc>
+      </w:tr>
+      <w:tr>
+        <w:tc>
+          <w:tcPr/>
+          <w:p>
+            <w:pPr>
+              <w:pStyle w:val="Compact"/>
+            </w:pPr>
+            <w:r>
+              <w:t xml:space="preserve">Position</w:t>
+            </w:r>
+          </w:p>
+        </w:tc>
+        <w:tc>
+          <w:tcPr/>
+          <w:p>
+            <w:pPr>
+              <w:pStyle w:val="Compact"/>
+            </w:pPr>
+            <w:r>
+              <w:t xml:space="preserve">36 vs 21</w:t>
+            </w:r>
+          </w:p>
+        </w:tc>
+        <w:tc>
+          <w:tcPr/>
+          <w:p>
+            <w:pPr>
+              <w:pStyle w:val="Compact"/>
+            </w:pPr>
+            <w:r>
+              <w:t xml:space="preserve">Medium-large (r &gt; 0.40)</w:t>
+            </w:r>
+          </w:p>
+        </w:tc>
+      </w:tr>
+    </w:tbl>
     <w:p>
       <w:pPr>
         <w:pStyle w:val="BodyText"/>
@@ -32570,7 +33059,7 @@
         <w:t xml:space="preserve">Note</w:t>
       </w:r>
       <w:r>
-        <w:t xml:space="preserve">: Group sizes are approximate and computed from the regional subset. The reduction from n=76 to n=57 further limits statistical power, particularly for already-small subgroups.</w:t>
+        <w:t xml:space="preserve">: The reduction from n=76 to n=57 further limits statistical power, particularly for already-small subgroups.</w:t>
       </w:r>
     </w:p>
     <w:p>
@@ -32582,10 +33071,10 @@
           <w:b/>
           <w:bCs/>
         </w:rPr>
-        <w:t xml:space="preserve">Gender comparisons warrant particular caution</w:t>
+        <w:t xml:space="preserve">Gender and Military comparisons warrant particular caution</w:t>
       </w:r>
       <w:r>
-        <w:t xml:space="preserve">: With approximately 5 female respondents in the regional subset, the analysis has very low power to detect even large effects - most true gender differences would go undetected.</w:t>
+        <w:t xml:space="preserve">: With only 5 female and 4 military-background respondents in the regional subset, these analyses have very low power to detect even large effects.</w:t>
       </w:r>
     </w:p>
     <w:bookmarkEnd w:id="92"/>

</xml_diff>

<commit_message>
refactor(qmd): update mod57 for U.S.-based regional airline pilots
- Change title to "U.S.-based Regional Airline Pilot Retention Analysis"
- Remove all "regional-only" sensitivity analysis framing
- Remove references to n=76 full sample analysis
- Update sample description and terminology throughout
- Simplify limitations section

🤖 Generated with [Claude Code](https://claude.com/claude-code)

Co-Authored-By: Claude Opus 4.5 <noreply@anthropic.com>
</commit_message>
<xml_diff>
--- a/output/reports/scripts/analysis/unified_retention_analysis-mod57.docx
+++ b/output/reports/scripts/analysis/unified_retention_analysis-mod57.docx
@@ -7,7 +7,7 @@
         <w:pStyle w:val="Title"/>
       </w:pPr>
       <w:r>
-        <w:t xml:space="preserve">U.S. Regional Airline Pilot Retention Analysis</w:t>
+        <w:t xml:space="preserve">U.S.-based Regional Airline Pilot Retention Analysis</w:t>
       </w:r>
     </w:p>
     <w:p>
@@ -15,7 +15,7 @@
         <w:pStyle w:val="Subtitle"/>
       </w:pPr>
       <w:r>
-        <w:t xml:space="preserve">General Factor Rankings and Subfactor Priorities (Regional Carriers Only, n=57)</w:t>
+        <w:t xml:space="preserve">General Factor Rankings and Subfactor Priorities (n=57)</w:t>
       </w:r>
     </w:p>
     <w:p>
@@ -63,7 +63,7 @@
         <w:pStyle w:val="Date"/>
       </w:pPr>
       <w:r>
-        <w:t xml:space="preserve">2025-12-31</w:t>
+        <w:t xml:space="preserve">2026-01-07</w:t>
       </w:r>
     </w:p>
     <w:sdt>
@@ -129,7 +129,7 @@
         <w:pStyle w:val="BodyText"/>
       </w:pPr>
       <w:r>
-        <w:t xml:space="preserve">This analysis examines pilot retention priorities from a survey of U.S. regional airline pilots (n = 57). This regional-only analysis was conducted as a sensitivity analysis to address scope-sample alignment, as regional carriers comprised 75% of the original sample.</w:t>
+        <w:t xml:space="preserve">This analysis examines pilot retention priorities from a survey of U.S.-based regional airline pilots (n = 57).</w:t>
       </w:r>
     </w:p>
     <w:p>
@@ -256,7 +256,7 @@
               <w:pStyle w:val="ImageCaption"/>
             </w:pPr>
             <w:r>
-              <w:t xml:space="preserve">Figure 1: Factors of Pilot Retention in U.S. Airlines</w:t>
+              <w:t xml:space="preserve">Figure 1: Factors of Pilot Retention in U.S.-based Regional Airlines</w:t>
             </w:r>
           </w:p>
           <w:bookmarkEnd w:id="24"/>
@@ -287,7 +287,7 @@
         <w:pStyle w:val="FirstParagraph"/>
       </w:pPr>
       <w:r>
-        <w:t xml:space="preserve">Survey data was collected from U.S. airline pilots in May 2025. After exclusions for incomplete responses, non-air carrier pilots, and restriction to regional airline pilots only, n = 57 valid responses remained for analysis. This regional-only subset addresses the original study’s scope-sample alignment where 75% of respondents were regional pilots.</w:t>
+        <w:t xml:space="preserve">Survey data was collected from U.S.-based regional airline pilots during April and May 2025. After exclusions for incomplete responses and non-regional airline pilots, n = 57 valid responses remained for analysis.</w:t>
       </w:r>
     </w:p>
     <w:bookmarkEnd w:id="26"/>
@@ -411,7 +411,7 @@
         <w:t xml:space="preserve"> </w:t>
       </w:r>
       <w:r>
-        <w:t xml:space="preserve">Benjamini-Hochberg FDR at q = 0.10 applied across all demographic comparisons (6 factors x 4 demographics; carrier type excluded in regional-only analysis).</w:t>
+        <w:t xml:space="preserve">Benjamini-Hochberg FDR at q = 0.10 applied across all demographic comparisons (6 factors x 4 demographics).</w:t>
       </w:r>
     </w:p>
     <w:p>
@@ -548,7 +548,7 @@
         <w:pStyle w:val="FirstParagraph"/>
       </w:pPr>
       <w:r>
-        <w:t xml:space="preserve">Analysis conducted in R 4.5.1 using: tidyverse, rstatix, coin, DescTools, knitr, janitor.</w:t>
+        <w:t xml:space="preserve">Analysis conducted in Positron (Version: 2025.12.2 build 5) with R 4.5.2 using: tidyverse, rstatix, coin, DescTools, knitr, janitor.</w:t>
       </w:r>
     </w:p>
     <w:p>
@@ -595,18 +595,6 @@
         </w:r>
       </w:hyperlink>
       <w:r>
-        <w:t xml:space="preserve">. The original full-sample analysis (n=76) is available at</w:t>
-      </w:r>
-      <w:r>
-        <w:t xml:space="preserve"> </w:t>
-      </w:r>
-      <w:r>
-        <w:rPr>
-          <w:rStyle w:val="VerbatimChar"/>
-        </w:rPr>
-        <w:t xml:space="preserve">scripts/analysis/unified_retention_analysis.qmd</w:t>
-      </w:r>
-      <w:r>
         <w:t xml:space="preserve">.</w:t>
       </w:r>
     </w:p>
@@ -851,7 +839,7 @@
               <w:t xml:space="preserve"> </w:t>
             </w:r>
             <w:r>
-              <w:t xml:space="preserve">Scope Restriction</w:t>
+              <w:t xml:space="preserve">Sample</w:t>
             </w:r>
           </w:p>
         </w:tc>
@@ -875,7 +863,7 @@
               <w:spacing w:before="16" w:after="16"/>
             </w:pPr>
             <w:r>
-              <w:t xml:space="preserve">This analysis is restricted to</w:t>
+              <w:t xml:space="preserve">This analysis includes</w:t>
             </w:r>
             <w:r>
               <w:t xml:space="preserve"> </w:t>
@@ -885,19 +873,13 @@
                 <w:b/>
                 <w:bCs/>
               </w:rPr>
-              <w:t xml:space="preserve">regional airline pilots only</w:t>
+              <w:t xml:space="preserve">U.S.-based regional airline pilots</w:t>
             </w:r>
             <w:r>
               <w:t xml:space="preserve"> </w:t>
             </w:r>
             <w:r>
               <w:t xml:space="preserve">(n = 57).</w:t>
-            </w:r>
-            <w:r>
-              <w:t xml:space="preserve"> </w:t>
-            </w:r>
-            <w:r>
-              <w:t xml:space="preserve">The original sample contained 76 pilots across carrier types (Regional: 57, Major: 11, LCC: 5, Other: 3).</w:t>
             </w:r>
           </w:p>
           <w:p/>
@@ -8964,7 +8946,7 @@
               <w:t xml:space="preserve"> </w:t>
             </w:r>
             <w:r>
-              <w:t xml:space="preserve">Not Applicable for Regional-Only Analysis</w:t>
+              <w:t xml:space="preserve">Not Applicable</w:t>
             </w:r>
           </w:p>
         </w:tc>
@@ -8988,23 +8970,7 @@
               <w:spacing w:before="16" w:after="16"/>
             </w:pPr>
             <w:r>
-              <w:t xml:space="preserve">Carrier type comparison is</w:t>
-            </w:r>
-            <w:r>
-              <w:t xml:space="preserve"> </w:t>
-            </w:r>
-            <w:r>
-              <w:rPr>
-                <w:b/>
-                <w:bCs/>
-              </w:rPr>
-              <w:t xml:space="preserve">not applicable</w:t>
-            </w:r>
-            <w:r>
-              <w:t xml:space="preserve"> </w:t>
-            </w:r>
-            <w:r>
-              <w:t xml:space="preserve">in this regional-only analysis. All 57 pilots in this sample are employed at regional airlines. See the original analysis (n=76) for carrier type comparisons across Regional, Major, LCC, and Other categories.</w:t>
+              <w:t xml:space="preserve">Carrier type comparison is not applicable as all 57 pilots in this sample are employed at U.S.-based regional airlines.</w:t>
             </w:r>
           </w:p>
           <w:p/>
@@ -32819,7 +32785,7 @@
         <w:pStyle w:val="FirstParagraph"/>
       </w:pPr>
       <w:r>
-        <w:t xml:space="preserve">The regional-only sample of n = 57 provides adequate power only for detecting large effects. For demographic comparisons:</w:t>
+        <w:t xml:space="preserve">The sample of n = 57 provides adequate power only for detecting large effects. For demographic comparisons:</w:t>
       </w:r>
     </w:p>
     <w:tbl>
@@ -33047,21 +33013,6 @@
         </w:tc>
       </w:tr>
     </w:tbl>
-    <w:p>
-      <w:pPr>
-        <w:pStyle w:val="BodyText"/>
-      </w:pPr>
-      <w:r>
-        <w:rPr>
-          <w:b/>
-          <w:bCs/>
-        </w:rPr>
-        <w:t xml:space="preserve">Note</w:t>
-      </w:r>
-      <w:r>
-        <w:t xml:space="preserve">: The reduction from n=76 to n=57 further limits statistical power, particularly for already-small subgroups.</w:t>
-      </w:r>
-    </w:p>
     <w:p>
       <w:pPr>
         <w:pStyle w:val="BodyText"/>
@@ -33161,25 +33112,6 @@
       </w:r>
       <w:r>
         <w:t xml:space="preserve">: Forced rankings prevent assessment of absolute importance; factors ranked low may still be important in absolute terms</w:t>
-      </w:r>
-    </w:p>
-    <w:p>
-      <w:pPr>
-        <w:pStyle w:val="Compact"/>
-        <w:numPr>
-          <w:ilvl w:val="0"/>
-          <w:numId w:val="1011"/>
-        </w:numPr>
-      </w:pPr>
-      <w:r>
-        <w:rPr>
-          <w:b/>
-          <w:bCs/>
-        </w:rPr>
-        <w:t xml:space="preserve">Scope Restriction</w:t>
-      </w:r>
-      <w:r>
-        <w:t xml:space="preserve">: This analysis excludes 19 pilots from major airlines (11), LCCs (5), and other carriers (3). While improving internal validity for regional airline conclusions, this limits generalizability to the broader U.S. airline pilot population</w:t>
       </w:r>
     </w:p>
     <w:bookmarkEnd w:id="93"/>

</xml_diff>

<commit_message>
fix(qmd): rename lifestyle to Quality of Life
- Change lifestyle_rank variable to qol_rank
- Update construct list text to "Quality of Life"

🤖 Generated with [Claude Code](https://claude.com/claude-code)

Co-Authored-By: Claude Opus 4.5 <noreply@anthropic.com>
</commit_message>
<xml_diff>
--- a/output/reports/scripts/analysis/unified_retention_analysis-mod57.docx
+++ b/output/reports/scripts/analysis/unified_retention_analysis-mod57.docx
@@ -1673,7 +1673,7 @@
         </w:numPr>
       </w:pPr>
       <w:r>
-        <w:t xml:space="preserve">Quality of Life/Lifestyle (schedule, family, work-life balance)</w:t>
+        <w:t xml:space="preserve">Quality of Life (schedule, family, work-life balance)</w:t>
       </w:r>
     </w:p>
     <w:p>
@@ -1916,7 +1916,7 @@
               <w:jc w:val="left"/>
             </w:pPr>
             <w:r>
-              <w:t xml:space="preserve">lifestyle</w:t>
+              <w:t xml:space="preserve">qol</w:t>
             </w:r>
           </w:p>
         </w:tc>
@@ -2356,7 +2356,7 @@
               <w:jc w:val="left"/>
             </w:pPr>
             <w:r>
-              <w:t xml:space="preserve">lifestyle</w:t>
+              <w:t xml:space="preserve">qol</w:t>
             </w:r>
           </w:p>
         </w:tc>
@@ -2882,7 +2882,131 @@
               <w:jc w:val="left"/>
             </w:pPr>
             <w:r>
-              <w:t xml:space="preserve">financial vs lifestyle</w:t>
+              <w:t xml:space="preserve">financial vs operational</w:t>
+            </w:r>
+          </w:p>
+        </w:tc>
+        <w:tc>
+          <w:tcPr/>
+          <w:p>
+            <w:pPr>
+              <w:pStyle w:val="Compact"/>
+              <w:jc w:val="right"/>
+            </w:pPr>
+            <w:r>
+              <w:t xml:space="preserve">133.5</w:t>
+            </w:r>
+          </w:p>
+        </w:tc>
+        <w:tc>
+          <w:tcPr/>
+          <w:p>
+            <w:pPr>
+              <w:pStyle w:val="Compact"/>
+              <w:jc w:val="right"/>
+            </w:pPr>
+            <w:r>
+              <w:t xml:space="preserve">0.000</w:t>
+            </w:r>
+          </w:p>
+        </w:tc>
+        <w:tc>
+          <w:tcPr/>
+          <w:p>
+            <w:pPr>
+              <w:pStyle w:val="Compact"/>
+              <w:jc w:val="right"/>
+            </w:pPr>
+            <w:r>
+              <w:t xml:space="preserve">0.0000</w:t>
+            </w:r>
+          </w:p>
+        </w:tc>
+        <w:tc>
+          <w:tcPr/>
+          <w:p>
+            <w:pPr>
+              <w:pStyle w:val="Compact"/>
+              <w:jc w:val="left"/>
+            </w:pPr>
+            <w:r>
+              <w:t xml:space="preserve">*</w:t>
+            </w:r>
+          </w:p>
+        </w:tc>
+      </w:tr>
+      <w:tr>
+        <w:tc>
+          <w:tcPr/>
+          <w:p>
+            <w:pPr>
+              <w:pStyle w:val="Compact"/>
+              <w:jc w:val="left"/>
+            </w:pPr>
+            <w:r>
+              <w:t xml:space="preserve">financial vs professional</w:t>
+            </w:r>
+          </w:p>
+        </w:tc>
+        <w:tc>
+          <w:tcPr/>
+          <w:p>
+            <w:pPr>
+              <w:pStyle w:val="Compact"/>
+              <w:jc w:val="right"/>
+            </w:pPr>
+            <w:r>
+              <w:t xml:space="preserve">104.5</w:t>
+            </w:r>
+          </w:p>
+        </w:tc>
+        <w:tc>
+          <w:tcPr/>
+          <w:p>
+            <w:pPr>
+              <w:pStyle w:val="Compact"/>
+              <w:jc w:val="right"/>
+            </w:pPr>
+            <w:r>
+              <w:t xml:space="preserve">0.000</w:t>
+            </w:r>
+          </w:p>
+        </w:tc>
+        <w:tc>
+          <w:tcPr/>
+          <w:p>
+            <w:pPr>
+              <w:pStyle w:val="Compact"/>
+              <w:jc w:val="right"/>
+            </w:pPr>
+            <w:r>
+              <w:t xml:space="preserve">0.0000</w:t>
+            </w:r>
+          </w:p>
+        </w:tc>
+        <w:tc>
+          <w:tcPr/>
+          <w:p>
+            <w:pPr>
+              <w:pStyle w:val="Compact"/>
+              <w:jc w:val="left"/>
+            </w:pPr>
+            <w:r>
+              <w:t xml:space="preserve">*</w:t>
+            </w:r>
+          </w:p>
+        </w:tc>
+      </w:tr>
+      <w:tr>
+        <w:tc>
+          <w:tcPr/>
+          <w:p>
+            <w:pPr>
+              <w:pStyle w:val="Compact"/>
+              <w:jc w:val="left"/>
+            </w:pPr>
+            <w:r>
+              <w:t xml:space="preserve">financial vs qol</w:t>
             </w:r>
           </w:p>
         </w:tc>
@@ -2940,19 +3064,19 @@
               <w:jc w:val="left"/>
             </w:pPr>
             <w:r>
-              <w:t xml:space="preserve">financial vs operational</w:t>
-            </w:r>
-          </w:p>
-        </w:tc>
-        <w:tc>
-          <w:tcPr/>
-          <w:p>
-            <w:pPr>
-              <w:pStyle w:val="Compact"/>
-              <w:jc w:val="right"/>
-            </w:pPr>
-            <w:r>
-              <w:t xml:space="preserve">133.5</w:t>
+              <w:t xml:space="preserve">financial vs recognition</w:t>
+            </w:r>
+          </w:p>
+        </w:tc>
+        <w:tc>
+          <w:tcPr/>
+          <w:p>
+            <w:pPr>
+              <w:pStyle w:val="Compact"/>
+              <w:jc w:val="right"/>
+            </w:pPr>
+            <w:r>
+              <w:t xml:space="preserve">8.5</w:t>
             </w:r>
           </w:p>
         </w:tc>
@@ -3002,19 +3126,135 @@
               <w:jc w:val="left"/>
             </w:pPr>
             <w:r>
-              <w:t xml:space="preserve">financial vs professional</w:t>
-            </w:r>
-          </w:p>
-        </w:tc>
-        <w:tc>
-          <w:tcPr/>
-          <w:p>
-            <w:pPr>
-              <w:pStyle w:val="Compact"/>
-              <w:jc w:val="right"/>
-            </w:pPr>
-            <w:r>
-              <w:t xml:space="preserve">104.5</w:t>
+              <w:t xml:space="preserve">financial vs schedule</w:t>
+            </w:r>
+          </w:p>
+        </w:tc>
+        <w:tc>
+          <w:tcPr/>
+          <w:p>
+            <w:pPr>
+              <w:pStyle w:val="Compact"/>
+              <w:jc w:val="right"/>
+            </w:pPr>
+            <w:r>
+              <w:t xml:space="preserve">704.0</w:t>
+            </w:r>
+          </w:p>
+        </w:tc>
+        <w:tc>
+          <w:tcPr/>
+          <w:p>
+            <w:pPr>
+              <w:pStyle w:val="Compact"/>
+              <w:jc w:val="right"/>
+            </w:pPr>
+            <w:r>
+              <w:t xml:space="preserve">0.316</w:t>
+            </w:r>
+          </w:p>
+        </w:tc>
+        <w:tc>
+          <w:tcPr/>
+          <w:p>
+            <w:pPr>
+              <w:pStyle w:val="Compact"/>
+              <w:jc w:val="right"/>
+            </w:pPr>
+            <w:r>
+              <w:t xml:space="preserve">0.9480</w:t>
+            </w:r>
+          </w:p>
+        </w:tc>
+        <w:tc>
+          <w:tcPr/>
+          <w:p>
+            <w:pPr>
+              <w:pStyle w:val="Compact"/>
+            </w:pPr>
+          </w:p>
+        </w:tc>
+      </w:tr>
+      <w:tr>
+        <w:tc>
+          <w:tcPr/>
+          <w:p>
+            <w:pPr>
+              <w:pStyle w:val="Compact"/>
+              <w:jc w:val="left"/>
+            </w:pPr>
+            <w:r>
+              <w:t xml:space="preserve">operational vs professional</w:t>
+            </w:r>
+          </w:p>
+        </w:tc>
+        <w:tc>
+          <w:tcPr/>
+          <w:p>
+            <w:pPr>
+              <w:pStyle w:val="Compact"/>
+              <w:jc w:val="right"/>
+            </w:pPr>
+            <w:r>
+              <w:t xml:space="preserve">826.0</w:t>
+            </w:r>
+          </w:p>
+        </w:tc>
+        <w:tc>
+          <w:tcPr/>
+          <w:p>
+            <w:pPr>
+              <w:pStyle w:val="Compact"/>
+              <w:jc w:val="right"/>
+            </w:pPr>
+            <w:r>
+              <w:t xml:space="preserve">1.000</w:t>
+            </w:r>
+          </w:p>
+        </w:tc>
+        <w:tc>
+          <w:tcPr/>
+          <w:p>
+            <w:pPr>
+              <w:pStyle w:val="Compact"/>
+              <w:jc w:val="right"/>
+            </w:pPr>
+            <w:r>
+              <w:t xml:space="preserve">1.0000</w:t>
+            </w:r>
+          </w:p>
+        </w:tc>
+        <w:tc>
+          <w:tcPr/>
+          <w:p>
+            <w:pPr>
+              <w:pStyle w:val="Compact"/>
+            </w:pPr>
+          </w:p>
+        </w:tc>
+      </w:tr>
+      <w:tr>
+        <w:tc>
+          <w:tcPr/>
+          <w:p>
+            <w:pPr>
+              <w:pStyle w:val="Compact"/>
+              <w:jc w:val="left"/>
+            </w:pPr>
+            <w:r>
+              <w:t xml:space="preserve">operational vs qol</w:t>
+            </w:r>
+          </w:p>
+        </w:tc>
+        <w:tc>
+          <w:tcPr/>
+          <w:p>
+            <w:pPr>
+              <w:pStyle w:val="Compact"/>
+              <w:jc w:val="right"/>
+            </w:pPr>
+            <w:r>
+              <w:t xml:space="preserve">1600.0</w:t>
             </w:r>
           </w:p>
         </w:tc>
@@ -3064,19 +3304,19 @@
               <w:jc w:val="left"/>
             </w:pPr>
             <w:r>
-              <w:t xml:space="preserve">financial vs recognition</w:t>
-            </w:r>
-          </w:p>
-        </w:tc>
-        <w:tc>
-          <w:tcPr/>
-          <w:p>
-            <w:pPr>
-              <w:pStyle w:val="Compact"/>
-              <w:jc w:val="right"/>
-            </w:pPr>
-            <w:r>
-              <w:t xml:space="preserve">8.5</w:t>
+              <w:t xml:space="preserve">operational vs recognition</w:t>
+            </w:r>
+          </w:p>
+        </w:tc>
+        <w:tc>
+          <w:tcPr/>
+          <w:p>
+            <w:pPr>
+              <w:pStyle w:val="Compact"/>
+              <w:jc w:val="right"/>
+            </w:pPr>
+            <w:r>
+              <w:t xml:space="preserve">311.5</w:t>
             </w:r>
           </w:p>
         </w:tc>
@@ -3100,6 +3340,68 @@
               <w:jc w:val="right"/>
             </w:pPr>
             <w:r>
+              <w:t xml:space="preserve">0.0002</w:t>
+            </w:r>
+          </w:p>
+        </w:tc>
+        <w:tc>
+          <w:tcPr/>
+          <w:p>
+            <w:pPr>
+              <w:pStyle w:val="Compact"/>
+              <w:jc w:val="left"/>
+            </w:pPr>
+            <w:r>
+              <w:t xml:space="preserve">*</w:t>
+            </w:r>
+          </w:p>
+        </w:tc>
+      </w:tr>
+      <w:tr>
+        <w:tc>
+          <w:tcPr/>
+          <w:p>
+            <w:pPr>
+              <w:pStyle w:val="Compact"/>
+              <w:jc w:val="left"/>
+            </w:pPr>
+            <w:r>
+              <w:t xml:space="preserve">operational vs schedule</w:t>
+            </w:r>
+          </w:p>
+        </w:tc>
+        <w:tc>
+          <w:tcPr/>
+          <w:p>
+            <w:pPr>
+              <w:pStyle w:val="Compact"/>
+              <w:jc w:val="right"/>
+            </w:pPr>
+            <w:r>
+              <w:t xml:space="preserve">1565.0</w:t>
+            </w:r>
+          </w:p>
+        </w:tc>
+        <w:tc>
+          <w:tcPr/>
+          <w:p>
+            <w:pPr>
+              <w:pStyle w:val="Compact"/>
+              <w:jc w:val="right"/>
+            </w:pPr>
+            <w:r>
+              <w:t xml:space="preserve">0.000</w:t>
+            </w:r>
+          </w:p>
+        </w:tc>
+        <w:tc>
+          <w:tcPr/>
+          <w:p>
+            <w:pPr>
+              <w:pStyle w:val="Compact"/>
+              <w:jc w:val="right"/>
+            </w:pPr>
+            <w:r>
               <w:t xml:space="preserve">0.0000</w:t>
             </w:r>
           </w:p>
@@ -3126,77 +3428,19 @@
               <w:jc w:val="left"/>
             </w:pPr>
             <w:r>
-              <w:t xml:space="preserve">financial vs schedule</w:t>
-            </w:r>
-          </w:p>
-        </w:tc>
-        <w:tc>
-          <w:tcPr/>
-          <w:p>
-            <w:pPr>
-              <w:pStyle w:val="Compact"/>
-              <w:jc w:val="right"/>
-            </w:pPr>
-            <w:r>
-              <w:t xml:space="preserve">704.0</w:t>
-            </w:r>
-          </w:p>
-        </w:tc>
-        <w:tc>
-          <w:tcPr/>
-          <w:p>
-            <w:pPr>
-              <w:pStyle w:val="Compact"/>
-              <w:jc w:val="right"/>
-            </w:pPr>
-            <w:r>
-              <w:t xml:space="preserve">0.316</w:t>
-            </w:r>
-          </w:p>
-        </w:tc>
-        <w:tc>
-          <w:tcPr/>
-          <w:p>
-            <w:pPr>
-              <w:pStyle w:val="Compact"/>
-              <w:jc w:val="right"/>
-            </w:pPr>
-            <w:r>
-              <w:t xml:space="preserve">0.9480</w:t>
-            </w:r>
-          </w:p>
-        </w:tc>
-        <w:tc>
-          <w:tcPr/>
-          <w:p>
-            <w:pPr>
-              <w:pStyle w:val="Compact"/>
-            </w:pPr>
-          </w:p>
-        </w:tc>
-      </w:tr>
-      <w:tr>
-        <w:tc>
-          <w:tcPr/>
-          <w:p>
-            <w:pPr>
-              <w:pStyle w:val="Compact"/>
-              <w:jc w:val="left"/>
-            </w:pPr>
-            <w:r>
-              <w:t xml:space="preserve">lifestyle vs operational</w:t>
-            </w:r>
-          </w:p>
-        </w:tc>
-        <w:tc>
-          <w:tcPr/>
-          <w:p>
-            <w:pPr>
-              <w:pStyle w:val="Compact"/>
-              <w:jc w:val="right"/>
-            </w:pPr>
-            <w:r>
-              <w:t xml:space="preserve">53.0</w:t>
+              <w:t xml:space="preserve">professional vs qol</w:t>
+            </w:r>
+          </w:p>
+        </w:tc>
+        <w:tc>
+          <w:tcPr/>
+          <w:p>
+            <w:pPr>
+              <w:pStyle w:val="Compact"/>
+              <w:jc w:val="right"/>
+            </w:pPr>
+            <w:r>
+              <w:t xml:space="preserve">1547.5</w:t>
             </w:r>
           </w:p>
         </w:tc>
@@ -3246,19 +3490,19 @@
               <w:jc w:val="left"/>
             </w:pPr>
             <w:r>
-              <w:t xml:space="preserve">lifestyle vs professional</w:t>
-            </w:r>
-          </w:p>
-        </w:tc>
-        <w:tc>
-          <w:tcPr/>
-          <w:p>
-            <w:pPr>
-              <w:pStyle w:val="Compact"/>
-              <w:jc w:val="right"/>
-            </w:pPr>
-            <w:r>
-              <w:t xml:space="preserve">105.5</w:t>
+              <w:t xml:space="preserve">professional vs recognition</w:t>
+            </w:r>
+          </w:p>
+        </w:tc>
+        <w:tc>
+          <w:tcPr/>
+          <w:p>
+            <w:pPr>
+              <w:pStyle w:val="Compact"/>
+              <w:jc w:val="right"/>
+            </w:pPr>
+            <w:r>
+              <w:t xml:space="preserve">288.5</w:t>
             </w:r>
           </w:p>
         </w:tc>
@@ -3282,6 +3526,68 @@
               <w:jc w:val="right"/>
             </w:pPr>
             <w:r>
+              <w:t xml:space="preserve">0.0001</w:t>
+            </w:r>
+          </w:p>
+        </w:tc>
+        <w:tc>
+          <w:tcPr/>
+          <w:p>
+            <w:pPr>
+              <w:pStyle w:val="Compact"/>
+              <w:jc w:val="left"/>
+            </w:pPr>
+            <w:r>
+              <w:t xml:space="preserve">*</w:t>
+            </w:r>
+          </w:p>
+        </w:tc>
+      </w:tr>
+      <w:tr>
+        <w:tc>
+          <w:tcPr/>
+          <w:p>
+            <w:pPr>
+              <w:pStyle w:val="Compact"/>
+              <w:jc w:val="left"/>
+            </w:pPr>
+            <w:r>
+              <w:t xml:space="preserve">professional vs schedule</w:t>
+            </w:r>
+          </w:p>
+        </w:tc>
+        <w:tc>
+          <w:tcPr/>
+          <w:p>
+            <w:pPr>
+              <w:pStyle w:val="Compact"/>
+              <w:jc w:val="right"/>
+            </w:pPr>
+            <w:r>
+              <w:t xml:space="preserve">1545.0</w:t>
+            </w:r>
+          </w:p>
+        </w:tc>
+        <w:tc>
+          <w:tcPr/>
+          <w:p>
+            <w:pPr>
+              <w:pStyle w:val="Compact"/>
+              <w:jc w:val="right"/>
+            </w:pPr>
+            <w:r>
+              <w:t xml:space="preserve">0.000</w:t>
+            </w:r>
+          </w:p>
+        </w:tc>
+        <w:tc>
+          <w:tcPr/>
+          <w:p>
+            <w:pPr>
+              <w:pStyle w:val="Compact"/>
+              <w:jc w:val="right"/>
+            </w:pPr>
+            <w:r>
               <w:t xml:space="preserve">0.0000</w:t>
             </w:r>
           </w:p>
@@ -3308,7 +3614,7 @@
               <w:jc w:val="left"/>
             </w:pPr>
             <w:r>
-              <w:t xml:space="preserve">lifestyle vs recognition</w:t>
+              <w:t xml:space="preserve">qol vs recognition</w:t>
             </w:r>
           </w:p>
         </w:tc>
@@ -3370,7 +3676,7 @@
               <w:jc w:val="left"/>
             </w:pPr>
             <w:r>
-              <w:t xml:space="preserve">lifestyle vs schedule</w:t>
+              <w:t xml:space="preserve">qol vs schedule</w:t>
             </w:r>
           </w:p>
         </w:tc>
@@ -3416,312 +3722,6 @@
             <w:pPr>
               <w:pStyle w:val="Compact"/>
             </w:pPr>
-          </w:p>
-        </w:tc>
-      </w:tr>
-      <w:tr>
-        <w:tc>
-          <w:tcPr/>
-          <w:p>
-            <w:pPr>
-              <w:pStyle w:val="Compact"/>
-              <w:jc w:val="left"/>
-            </w:pPr>
-            <w:r>
-              <w:t xml:space="preserve">operational vs professional</w:t>
-            </w:r>
-          </w:p>
-        </w:tc>
-        <w:tc>
-          <w:tcPr/>
-          <w:p>
-            <w:pPr>
-              <w:pStyle w:val="Compact"/>
-              <w:jc w:val="right"/>
-            </w:pPr>
-            <w:r>
-              <w:t xml:space="preserve">826.0</w:t>
-            </w:r>
-          </w:p>
-        </w:tc>
-        <w:tc>
-          <w:tcPr/>
-          <w:p>
-            <w:pPr>
-              <w:pStyle w:val="Compact"/>
-              <w:jc w:val="right"/>
-            </w:pPr>
-            <w:r>
-              <w:t xml:space="preserve">1.000</w:t>
-            </w:r>
-          </w:p>
-        </w:tc>
-        <w:tc>
-          <w:tcPr/>
-          <w:p>
-            <w:pPr>
-              <w:pStyle w:val="Compact"/>
-              <w:jc w:val="right"/>
-            </w:pPr>
-            <w:r>
-              <w:t xml:space="preserve">1.0000</w:t>
-            </w:r>
-          </w:p>
-        </w:tc>
-        <w:tc>
-          <w:tcPr/>
-          <w:p>
-            <w:pPr>
-              <w:pStyle w:val="Compact"/>
-            </w:pPr>
-          </w:p>
-        </w:tc>
-      </w:tr>
-      <w:tr>
-        <w:tc>
-          <w:tcPr/>
-          <w:p>
-            <w:pPr>
-              <w:pStyle w:val="Compact"/>
-              <w:jc w:val="left"/>
-            </w:pPr>
-            <w:r>
-              <w:t xml:space="preserve">operational vs recognition</w:t>
-            </w:r>
-          </w:p>
-        </w:tc>
-        <w:tc>
-          <w:tcPr/>
-          <w:p>
-            <w:pPr>
-              <w:pStyle w:val="Compact"/>
-              <w:jc w:val="right"/>
-            </w:pPr>
-            <w:r>
-              <w:t xml:space="preserve">311.5</w:t>
-            </w:r>
-          </w:p>
-        </w:tc>
-        <w:tc>
-          <w:tcPr/>
-          <w:p>
-            <w:pPr>
-              <w:pStyle w:val="Compact"/>
-              <w:jc w:val="right"/>
-            </w:pPr>
-            <w:r>
-              <w:t xml:space="preserve">0.000</w:t>
-            </w:r>
-          </w:p>
-        </w:tc>
-        <w:tc>
-          <w:tcPr/>
-          <w:p>
-            <w:pPr>
-              <w:pStyle w:val="Compact"/>
-              <w:jc w:val="right"/>
-            </w:pPr>
-            <w:r>
-              <w:t xml:space="preserve">0.0002</w:t>
-            </w:r>
-          </w:p>
-        </w:tc>
-        <w:tc>
-          <w:tcPr/>
-          <w:p>
-            <w:pPr>
-              <w:pStyle w:val="Compact"/>
-              <w:jc w:val="left"/>
-            </w:pPr>
-            <w:r>
-              <w:t xml:space="preserve">*</w:t>
-            </w:r>
-          </w:p>
-        </w:tc>
-      </w:tr>
-      <w:tr>
-        <w:tc>
-          <w:tcPr/>
-          <w:p>
-            <w:pPr>
-              <w:pStyle w:val="Compact"/>
-              <w:jc w:val="left"/>
-            </w:pPr>
-            <w:r>
-              <w:t xml:space="preserve">operational vs schedule</w:t>
-            </w:r>
-          </w:p>
-        </w:tc>
-        <w:tc>
-          <w:tcPr/>
-          <w:p>
-            <w:pPr>
-              <w:pStyle w:val="Compact"/>
-              <w:jc w:val="right"/>
-            </w:pPr>
-            <w:r>
-              <w:t xml:space="preserve">1565.0</w:t>
-            </w:r>
-          </w:p>
-        </w:tc>
-        <w:tc>
-          <w:tcPr/>
-          <w:p>
-            <w:pPr>
-              <w:pStyle w:val="Compact"/>
-              <w:jc w:val="right"/>
-            </w:pPr>
-            <w:r>
-              <w:t xml:space="preserve">0.000</w:t>
-            </w:r>
-          </w:p>
-        </w:tc>
-        <w:tc>
-          <w:tcPr/>
-          <w:p>
-            <w:pPr>
-              <w:pStyle w:val="Compact"/>
-              <w:jc w:val="right"/>
-            </w:pPr>
-            <w:r>
-              <w:t xml:space="preserve">0.0000</w:t>
-            </w:r>
-          </w:p>
-        </w:tc>
-        <w:tc>
-          <w:tcPr/>
-          <w:p>
-            <w:pPr>
-              <w:pStyle w:val="Compact"/>
-              <w:jc w:val="left"/>
-            </w:pPr>
-            <w:r>
-              <w:t xml:space="preserve">*</w:t>
-            </w:r>
-          </w:p>
-        </w:tc>
-      </w:tr>
-      <w:tr>
-        <w:tc>
-          <w:tcPr/>
-          <w:p>
-            <w:pPr>
-              <w:pStyle w:val="Compact"/>
-              <w:jc w:val="left"/>
-            </w:pPr>
-            <w:r>
-              <w:t xml:space="preserve">professional vs recognition</w:t>
-            </w:r>
-          </w:p>
-        </w:tc>
-        <w:tc>
-          <w:tcPr/>
-          <w:p>
-            <w:pPr>
-              <w:pStyle w:val="Compact"/>
-              <w:jc w:val="right"/>
-            </w:pPr>
-            <w:r>
-              <w:t xml:space="preserve">288.5</w:t>
-            </w:r>
-          </w:p>
-        </w:tc>
-        <w:tc>
-          <w:tcPr/>
-          <w:p>
-            <w:pPr>
-              <w:pStyle w:val="Compact"/>
-              <w:jc w:val="right"/>
-            </w:pPr>
-            <w:r>
-              <w:t xml:space="preserve">0.000</w:t>
-            </w:r>
-          </w:p>
-        </w:tc>
-        <w:tc>
-          <w:tcPr/>
-          <w:p>
-            <w:pPr>
-              <w:pStyle w:val="Compact"/>
-              <w:jc w:val="right"/>
-            </w:pPr>
-            <w:r>
-              <w:t xml:space="preserve">0.0001</w:t>
-            </w:r>
-          </w:p>
-        </w:tc>
-        <w:tc>
-          <w:tcPr/>
-          <w:p>
-            <w:pPr>
-              <w:pStyle w:val="Compact"/>
-              <w:jc w:val="left"/>
-            </w:pPr>
-            <w:r>
-              <w:t xml:space="preserve">*</w:t>
-            </w:r>
-          </w:p>
-        </w:tc>
-      </w:tr>
-      <w:tr>
-        <w:tc>
-          <w:tcPr/>
-          <w:p>
-            <w:pPr>
-              <w:pStyle w:val="Compact"/>
-              <w:jc w:val="left"/>
-            </w:pPr>
-            <w:r>
-              <w:t xml:space="preserve">professional vs schedule</w:t>
-            </w:r>
-          </w:p>
-        </w:tc>
-        <w:tc>
-          <w:tcPr/>
-          <w:p>
-            <w:pPr>
-              <w:pStyle w:val="Compact"/>
-              <w:jc w:val="right"/>
-            </w:pPr>
-            <w:r>
-              <w:t xml:space="preserve">1545.0</w:t>
-            </w:r>
-          </w:p>
-        </w:tc>
-        <w:tc>
-          <w:tcPr/>
-          <w:p>
-            <w:pPr>
-              <w:pStyle w:val="Compact"/>
-              <w:jc w:val="right"/>
-            </w:pPr>
-            <w:r>
-              <w:t xml:space="preserve">0.000</w:t>
-            </w:r>
-          </w:p>
-        </w:tc>
-        <w:tc>
-          <w:tcPr/>
-          <w:p>
-            <w:pPr>
-              <w:pStyle w:val="Compact"/>
-              <w:jc w:val="right"/>
-            </w:pPr>
-            <w:r>
-              <w:t xml:space="preserve">0.0000</w:t>
-            </w:r>
-          </w:p>
-        </w:tc>
-        <w:tc>
-          <w:tcPr/>
-          <w:p>
-            <w:pPr>
-              <w:pStyle w:val="Compact"/>
-              <w:jc w:val="left"/>
-            </w:pPr>
-            <w:r>
-              <w:t xml:space="preserve">*</w:t>
-            </w:r>
           </w:p>
         </w:tc>
       </w:tr>
@@ -3982,7 +3982,7 @@
               <w:jc w:val="left"/>
             </w:pPr>
             <w:r>
-              <w:t xml:space="preserve">lifestyle</w:t>
+              <w:t xml:space="preserve">qol</w:t>
             </w:r>
           </w:p>
         </w:tc>
@@ -5027,7 +5027,7 @@
               <w:jc w:val="left"/>
             </w:pPr>
             <w:r>
-              <w:t xml:space="preserve">lifestyle</w:t>
+              <w:t xml:space="preserve">operational</w:t>
             </w:r>
           </w:p>
         </w:tc>
@@ -5087,6 +5087,226 @@
               <w:jc w:val="right"/>
             </w:pPr>
             <w:r>
+              <w:t xml:space="preserve">4</w:t>
+            </w:r>
+          </w:p>
+        </w:tc>
+        <w:tc>
+          <w:tcPr/>
+          <w:p>
+            <w:pPr>
+              <w:pStyle w:val="Compact"/>
+              <w:jc w:val="right"/>
+            </w:pPr>
+            <w:r>
+              <w:t xml:space="preserve">5.0</w:t>
+            </w:r>
+          </w:p>
+        </w:tc>
+        <w:tc>
+          <w:tcPr/>
+          <w:p>
+            <w:pPr>
+              <w:pStyle w:val="Compact"/>
+              <w:jc w:val="right"/>
+            </w:pPr>
+            <w:r>
+              <w:t xml:space="preserve">4</w:t>
+            </w:r>
+          </w:p>
+        </w:tc>
+        <w:tc>
+          <w:tcPr/>
+          <w:p>
+            <w:pPr>
+              <w:pStyle w:val="Compact"/>
+              <w:jc w:val="right"/>
+            </w:pPr>
+            <w:r>
+              <w:t xml:space="preserve">4.0</w:t>
+            </w:r>
+          </w:p>
+        </w:tc>
+      </w:tr>
+      <w:tr>
+        <w:tc>
+          <w:tcPr/>
+          <w:p>
+            <w:pPr>
+              <w:pStyle w:val="Compact"/>
+              <w:jc w:val="left"/>
+            </w:pPr>
+            <w:r>
+              <w:t xml:space="preserve">professional</w:t>
+            </w:r>
+          </w:p>
+        </w:tc>
+        <w:tc>
+          <w:tcPr/>
+          <w:p>
+            <w:pPr>
+              <w:pStyle w:val="Compact"/>
+              <w:jc w:val="right"/>
+            </w:pPr>
+            <w:r>
+              <w:t xml:space="preserve">15</w:t>
+            </w:r>
+          </w:p>
+        </w:tc>
+        <w:tc>
+          <w:tcPr/>
+          <w:p>
+            <w:pPr>
+              <w:pStyle w:val="Compact"/>
+              <w:jc w:val="right"/>
+            </w:pPr>
+            <w:r>
+              <w:t xml:space="preserve">14</w:t>
+            </w:r>
+          </w:p>
+        </w:tc>
+        <w:tc>
+          <w:tcPr/>
+          <w:p>
+            <w:pPr>
+              <w:pStyle w:val="Compact"/>
+              <w:jc w:val="right"/>
+            </w:pPr>
+            <w:r>
+              <w:t xml:space="preserve">14</w:t>
+            </w:r>
+          </w:p>
+        </w:tc>
+        <w:tc>
+          <w:tcPr/>
+          <w:p>
+            <w:pPr>
+              <w:pStyle w:val="Compact"/>
+              <w:jc w:val="right"/>
+            </w:pPr>
+            <w:r>
+              <w:t xml:space="preserve">14</w:t>
+            </w:r>
+          </w:p>
+        </w:tc>
+        <w:tc>
+          <w:tcPr/>
+          <w:p>
+            <w:pPr>
+              <w:pStyle w:val="Compact"/>
+              <w:jc w:val="right"/>
+            </w:pPr>
+            <w:r>
+              <w:t xml:space="preserve">4</w:t>
+            </w:r>
+          </w:p>
+        </w:tc>
+        <w:tc>
+          <w:tcPr/>
+          <w:p>
+            <w:pPr>
+              <w:pStyle w:val="Compact"/>
+              <w:jc w:val="right"/>
+            </w:pPr>
+            <w:r>
+              <w:t xml:space="preserve">4.5</w:t>
+            </w:r>
+          </w:p>
+        </w:tc>
+        <w:tc>
+          <w:tcPr/>
+          <w:p>
+            <w:pPr>
+              <w:pStyle w:val="Compact"/>
+              <w:jc w:val="right"/>
+            </w:pPr>
+            <w:r>
+              <w:t xml:space="preserve">5</w:t>
+            </w:r>
+          </w:p>
+        </w:tc>
+        <w:tc>
+          <w:tcPr/>
+          <w:p>
+            <w:pPr>
+              <w:pStyle w:val="Compact"/>
+              <w:jc w:val="right"/>
+            </w:pPr>
+            <w:r>
+              <w:t xml:space="preserve">5.0</w:t>
+            </w:r>
+          </w:p>
+        </w:tc>
+      </w:tr>
+      <w:tr>
+        <w:tc>
+          <w:tcPr/>
+          <w:p>
+            <w:pPr>
+              <w:pStyle w:val="Compact"/>
+              <w:jc w:val="left"/>
+            </w:pPr>
+            <w:r>
+              <w:t xml:space="preserve">qol</w:t>
+            </w:r>
+          </w:p>
+        </w:tc>
+        <w:tc>
+          <w:tcPr/>
+          <w:p>
+            <w:pPr>
+              <w:pStyle w:val="Compact"/>
+              <w:jc w:val="right"/>
+            </w:pPr>
+            <w:r>
+              <w:t xml:space="preserve">15</w:t>
+            </w:r>
+          </w:p>
+        </w:tc>
+        <w:tc>
+          <w:tcPr/>
+          <w:p>
+            <w:pPr>
+              <w:pStyle w:val="Compact"/>
+              <w:jc w:val="right"/>
+            </w:pPr>
+            <w:r>
+              <w:t xml:space="preserve">14</w:t>
+            </w:r>
+          </w:p>
+        </w:tc>
+        <w:tc>
+          <w:tcPr/>
+          <w:p>
+            <w:pPr>
+              <w:pStyle w:val="Compact"/>
+              <w:jc w:val="right"/>
+            </w:pPr>
+            <w:r>
+              <w:t xml:space="preserve">14</w:t>
+            </w:r>
+          </w:p>
+        </w:tc>
+        <w:tc>
+          <w:tcPr/>
+          <w:p>
+            <w:pPr>
+              <w:pStyle w:val="Compact"/>
+              <w:jc w:val="right"/>
+            </w:pPr>
+            <w:r>
+              <w:t xml:space="preserve">14</w:t>
+            </w:r>
+          </w:p>
+        </w:tc>
+        <w:tc>
+          <w:tcPr/>
+          <w:p>
+            <w:pPr>
+              <w:pStyle w:val="Compact"/>
+              <w:jc w:val="right"/>
+            </w:pPr>
+            <w:r>
               <w:t xml:space="preserve">1</w:t>
             </w:r>
           </w:p>
@@ -5124,226 +5344,6 @@
             </w:pPr>
             <w:r>
               <w:t xml:space="preserve">2.0</w:t>
-            </w:r>
-          </w:p>
-        </w:tc>
-      </w:tr>
-      <w:tr>
-        <w:tc>
-          <w:tcPr/>
-          <w:p>
-            <w:pPr>
-              <w:pStyle w:val="Compact"/>
-              <w:jc w:val="left"/>
-            </w:pPr>
-            <w:r>
-              <w:t xml:space="preserve">operational</w:t>
-            </w:r>
-          </w:p>
-        </w:tc>
-        <w:tc>
-          <w:tcPr/>
-          <w:p>
-            <w:pPr>
-              <w:pStyle w:val="Compact"/>
-              <w:jc w:val="right"/>
-            </w:pPr>
-            <w:r>
-              <w:t xml:space="preserve">15</w:t>
-            </w:r>
-          </w:p>
-        </w:tc>
-        <w:tc>
-          <w:tcPr/>
-          <w:p>
-            <w:pPr>
-              <w:pStyle w:val="Compact"/>
-              <w:jc w:val="right"/>
-            </w:pPr>
-            <w:r>
-              <w:t xml:space="preserve">14</w:t>
-            </w:r>
-          </w:p>
-        </w:tc>
-        <w:tc>
-          <w:tcPr/>
-          <w:p>
-            <w:pPr>
-              <w:pStyle w:val="Compact"/>
-              <w:jc w:val="right"/>
-            </w:pPr>
-            <w:r>
-              <w:t xml:space="preserve">14</w:t>
-            </w:r>
-          </w:p>
-        </w:tc>
-        <w:tc>
-          <w:tcPr/>
-          <w:p>
-            <w:pPr>
-              <w:pStyle w:val="Compact"/>
-              <w:jc w:val="right"/>
-            </w:pPr>
-            <w:r>
-              <w:t xml:space="preserve">14</w:t>
-            </w:r>
-          </w:p>
-        </w:tc>
-        <w:tc>
-          <w:tcPr/>
-          <w:p>
-            <w:pPr>
-              <w:pStyle w:val="Compact"/>
-              <w:jc w:val="right"/>
-            </w:pPr>
-            <w:r>
-              <w:t xml:space="preserve">4</w:t>
-            </w:r>
-          </w:p>
-        </w:tc>
-        <w:tc>
-          <w:tcPr/>
-          <w:p>
-            <w:pPr>
-              <w:pStyle w:val="Compact"/>
-              <w:jc w:val="right"/>
-            </w:pPr>
-            <w:r>
-              <w:t xml:space="preserve">5.0</w:t>
-            </w:r>
-          </w:p>
-        </w:tc>
-        <w:tc>
-          <w:tcPr/>
-          <w:p>
-            <w:pPr>
-              <w:pStyle w:val="Compact"/>
-              <w:jc w:val="right"/>
-            </w:pPr>
-            <w:r>
-              <w:t xml:space="preserve">4</w:t>
-            </w:r>
-          </w:p>
-        </w:tc>
-        <w:tc>
-          <w:tcPr/>
-          <w:p>
-            <w:pPr>
-              <w:pStyle w:val="Compact"/>
-              <w:jc w:val="right"/>
-            </w:pPr>
-            <w:r>
-              <w:t xml:space="preserve">4.0</w:t>
-            </w:r>
-          </w:p>
-        </w:tc>
-      </w:tr>
-      <w:tr>
-        <w:tc>
-          <w:tcPr/>
-          <w:p>
-            <w:pPr>
-              <w:pStyle w:val="Compact"/>
-              <w:jc w:val="left"/>
-            </w:pPr>
-            <w:r>
-              <w:t xml:space="preserve">professional</w:t>
-            </w:r>
-          </w:p>
-        </w:tc>
-        <w:tc>
-          <w:tcPr/>
-          <w:p>
-            <w:pPr>
-              <w:pStyle w:val="Compact"/>
-              <w:jc w:val="right"/>
-            </w:pPr>
-            <w:r>
-              <w:t xml:space="preserve">15</w:t>
-            </w:r>
-          </w:p>
-        </w:tc>
-        <w:tc>
-          <w:tcPr/>
-          <w:p>
-            <w:pPr>
-              <w:pStyle w:val="Compact"/>
-              <w:jc w:val="right"/>
-            </w:pPr>
-            <w:r>
-              <w:t xml:space="preserve">14</w:t>
-            </w:r>
-          </w:p>
-        </w:tc>
-        <w:tc>
-          <w:tcPr/>
-          <w:p>
-            <w:pPr>
-              <w:pStyle w:val="Compact"/>
-              <w:jc w:val="right"/>
-            </w:pPr>
-            <w:r>
-              <w:t xml:space="preserve">14</w:t>
-            </w:r>
-          </w:p>
-        </w:tc>
-        <w:tc>
-          <w:tcPr/>
-          <w:p>
-            <w:pPr>
-              <w:pStyle w:val="Compact"/>
-              <w:jc w:val="right"/>
-            </w:pPr>
-            <w:r>
-              <w:t xml:space="preserve">14</w:t>
-            </w:r>
-          </w:p>
-        </w:tc>
-        <w:tc>
-          <w:tcPr/>
-          <w:p>
-            <w:pPr>
-              <w:pStyle w:val="Compact"/>
-              <w:jc w:val="right"/>
-            </w:pPr>
-            <w:r>
-              <w:t xml:space="preserve">4</w:t>
-            </w:r>
-          </w:p>
-        </w:tc>
-        <w:tc>
-          <w:tcPr/>
-          <w:p>
-            <w:pPr>
-              <w:pStyle w:val="Compact"/>
-              <w:jc w:val="right"/>
-            </w:pPr>
-            <w:r>
-              <w:t xml:space="preserve">4.5</w:t>
-            </w:r>
-          </w:p>
-        </w:tc>
-        <w:tc>
-          <w:tcPr/>
-          <w:p>
-            <w:pPr>
-              <w:pStyle w:val="Compact"/>
-              <w:jc w:val="right"/>
-            </w:pPr>
-            <w:r>
-              <w:t xml:space="preserve">5</w:t>
-            </w:r>
-          </w:p>
-        </w:tc>
-        <w:tc>
-          <w:tcPr/>
-          <w:p>
-            <w:pPr>
-              <w:pStyle w:val="Compact"/>
-              <w:jc w:val="right"/>
-            </w:pPr>
-            <w:r>
-              <w:t xml:space="preserve">5.0</w:t>
             </w:r>
           </w:p>
         </w:tc>
@@ -5748,7 +5748,147 @@
               <w:jc w:val="left"/>
             </w:pPr>
             <w:r>
-              <w:t xml:space="preserve">lifestyle</w:t>
+              <w:t xml:space="preserve">operational</w:t>
+            </w:r>
+          </w:p>
+        </w:tc>
+        <w:tc>
+          <w:tcPr/>
+          <w:p>
+            <w:pPr>
+              <w:pStyle w:val="Compact"/>
+              <w:jc w:val="right"/>
+            </w:pPr>
+            <w:r>
+              <w:t xml:space="preserve">2.673</w:t>
+            </w:r>
+          </w:p>
+        </w:tc>
+        <w:tc>
+          <w:tcPr/>
+          <w:p>
+            <w:pPr>
+              <w:pStyle w:val="Compact"/>
+              <w:jc w:val="right"/>
+            </w:pPr>
+            <w:r>
+              <w:t xml:space="preserve">3</w:t>
+            </w:r>
+          </w:p>
+        </w:tc>
+        <w:tc>
+          <w:tcPr/>
+          <w:p>
+            <w:pPr>
+              <w:pStyle w:val="Compact"/>
+              <w:jc w:val="right"/>
+            </w:pPr>
+            <w:r>
+              <w:t xml:space="preserve">0.445</w:t>
+            </w:r>
+          </w:p>
+        </w:tc>
+        <w:tc>
+          <w:tcPr/>
+          <w:p>
+            <w:pPr>
+              <w:pStyle w:val="Compact"/>
+              <w:jc w:val="right"/>
+            </w:pPr>
+            <w:r>
+              <w:t xml:space="preserve">0.534</w:t>
+            </w:r>
+          </w:p>
+        </w:tc>
+        <w:tc>
+          <w:tcPr/>
+          <w:p>
+            <w:pPr>
+              <w:pStyle w:val="Compact"/>
+            </w:pPr>
+          </w:p>
+        </w:tc>
+      </w:tr>
+      <w:tr>
+        <w:tc>
+          <w:tcPr/>
+          <w:p>
+            <w:pPr>
+              <w:pStyle w:val="Compact"/>
+              <w:jc w:val="left"/>
+            </w:pPr>
+            <w:r>
+              <w:t xml:space="preserve">professional</w:t>
+            </w:r>
+          </w:p>
+        </w:tc>
+        <w:tc>
+          <w:tcPr/>
+          <w:p>
+            <w:pPr>
+              <w:pStyle w:val="Compact"/>
+              <w:jc w:val="right"/>
+            </w:pPr>
+            <w:r>
+              <w:t xml:space="preserve">1.675</w:t>
+            </w:r>
+          </w:p>
+        </w:tc>
+        <w:tc>
+          <w:tcPr/>
+          <w:p>
+            <w:pPr>
+              <w:pStyle w:val="Compact"/>
+              <w:jc w:val="right"/>
+            </w:pPr>
+            <w:r>
+              <w:t xml:space="preserve">3</w:t>
+            </w:r>
+          </w:p>
+        </w:tc>
+        <w:tc>
+          <w:tcPr/>
+          <w:p>
+            <w:pPr>
+              <w:pStyle w:val="Compact"/>
+              <w:jc w:val="right"/>
+            </w:pPr>
+            <w:r>
+              <w:t xml:space="preserve">0.643</w:t>
+            </w:r>
+          </w:p>
+        </w:tc>
+        <w:tc>
+          <w:tcPr/>
+          <w:p>
+            <w:pPr>
+              <w:pStyle w:val="Compact"/>
+              <w:jc w:val="right"/>
+            </w:pPr>
+            <w:r>
+              <w:t xml:space="preserve">0.643</w:t>
+            </w:r>
+          </w:p>
+        </w:tc>
+        <w:tc>
+          <w:tcPr/>
+          <w:p>
+            <w:pPr>
+              <w:pStyle w:val="Compact"/>
+            </w:pPr>
+          </w:p>
+        </w:tc>
+      </w:tr>
+      <w:tr>
+        <w:tc>
+          <w:tcPr/>
+          <w:p>
+            <w:pPr>
+              <w:pStyle w:val="Compact"/>
+              <w:jc w:val="left"/>
+            </w:pPr>
+            <w:r>
+              <w:t xml:space="preserve">qol</w:t>
             </w:r>
           </w:p>
         </w:tc>
@@ -5797,146 +5937,6 @@
             </w:pPr>
             <w:r>
               <w:t xml:space="preserve">0.300</w:t>
-            </w:r>
-          </w:p>
-        </w:tc>
-        <w:tc>
-          <w:tcPr/>
-          <w:p>
-            <w:pPr>
-              <w:pStyle w:val="Compact"/>
-            </w:pPr>
-          </w:p>
-        </w:tc>
-      </w:tr>
-      <w:tr>
-        <w:tc>
-          <w:tcPr/>
-          <w:p>
-            <w:pPr>
-              <w:pStyle w:val="Compact"/>
-              <w:jc w:val="left"/>
-            </w:pPr>
-            <w:r>
-              <w:t xml:space="preserve">operational</w:t>
-            </w:r>
-          </w:p>
-        </w:tc>
-        <w:tc>
-          <w:tcPr/>
-          <w:p>
-            <w:pPr>
-              <w:pStyle w:val="Compact"/>
-              <w:jc w:val="right"/>
-            </w:pPr>
-            <w:r>
-              <w:t xml:space="preserve">2.673</w:t>
-            </w:r>
-          </w:p>
-        </w:tc>
-        <w:tc>
-          <w:tcPr/>
-          <w:p>
-            <w:pPr>
-              <w:pStyle w:val="Compact"/>
-              <w:jc w:val="right"/>
-            </w:pPr>
-            <w:r>
-              <w:t xml:space="preserve">3</w:t>
-            </w:r>
-          </w:p>
-        </w:tc>
-        <w:tc>
-          <w:tcPr/>
-          <w:p>
-            <w:pPr>
-              <w:pStyle w:val="Compact"/>
-              <w:jc w:val="right"/>
-            </w:pPr>
-            <w:r>
-              <w:t xml:space="preserve">0.445</w:t>
-            </w:r>
-          </w:p>
-        </w:tc>
-        <w:tc>
-          <w:tcPr/>
-          <w:p>
-            <w:pPr>
-              <w:pStyle w:val="Compact"/>
-              <w:jc w:val="right"/>
-            </w:pPr>
-            <w:r>
-              <w:t xml:space="preserve">0.534</w:t>
-            </w:r>
-          </w:p>
-        </w:tc>
-        <w:tc>
-          <w:tcPr/>
-          <w:p>
-            <w:pPr>
-              <w:pStyle w:val="Compact"/>
-            </w:pPr>
-          </w:p>
-        </w:tc>
-      </w:tr>
-      <w:tr>
-        <w:tc>
-          <w:tcPr/>
-          <w:p>
-            <w:pPr>
-              <w:pStyle w:val="Compact"/>
-              <w:jc w:val="left"/>
-            </w:pPr>
-            <w:r>
-              <w:t xml:space="preserve">professional</w:t>
-            </w:r>
-          </w:p>
-        </w:tc>
-        <w:tc>
-          <w:tcPr/>
-          <w:p>
-            <w:pPr>
-              <w:pStyle w:val="Compact"/>
-              <w:jc w:val="right"/>
-            </w:pPr>
-            <w:r>
-              <w:t xml:space="preserve">1.675</w:t>
-            </w:r>
-          </w:p>
-        </w:tc>
-        <w:tc>
-          <w:tcPr/>
-          <w:p>
-            <w:pPr>
-              <w:pStyle w:val="Compact"/>
-              <w:jc w:val="right"/>
-            </w:pPr>
-            <w:r>
-              <w:t xml:space="preserve">3</w:t>
-            </w:r>
-          </w:p>
-        </w:tc>
-        <w:tc>
-          <w:tcPr/>
-          <w:p>
-            <w:pPr>
-              <w:pStyle w:val="Compact"/>
-              <w:jc w:val="right"/>
-            </w:pPr>
-            <w:r>
-              <w:t xml:space="preserve">0.643</w:t>
-            </w:r>
-          </w:p>
-        </w:tc>
-        <w:tc>
-          <w:tcPr/>
-          <w:p>
-            <w:pPr>
-              <w:pStyle w:val="Compact"/>
-              <w:jc w:val="right"/>
-            </w:pPr>
-            <w:r>
-              <w:t xml:space="preserve">0.643</w:t>
             </w:r>
           </w:p>
         </w:tc>
@@ -6258,7 +6258,7 @@
               <w:jc w:val="left"/>
             </w:pPr>
             <w:r>
-              <w:t xml:space="preserve">lifestyle</w:t>
+              <w:t xml:space="preserve">operational</w:t>
             </w:r>
           </w:p>
         </w:tc>
@@ -6294,6 +6294,130 @@
               <w:jc w:val="right"/>
             </w:pPr>
             <w:r>
+              <w:t xml:space="preserve">4</w:t>
+            </w:r>
+          </w:p>
+        </w:tc>
+        <w:tc>
+          <w:tcPr/>
+          <w:p>
+            <w:pPr>
+              <w:pStyle w:val="Compact"/>
+              <w:jc w:val="right"/>
+            </w:pPr>
+            <w:r>
+              <w:t xml:space="preserve">5</w:t>
+            </w:r>
+          </w:p>
+        </w:tc>
+      </w:tr>
+      <w:tr>
+        <w:tc>
+          <w:tcPr/>
+          <w:p>
+            <w:pPr>
+              <w:pStyle w:val="Compact"/>
+              <w:jc w:val="left"/>
+            </w:pPr>
+            <w:r>
+              <w:t xml:space="preserve">professional</w:t>
+            </w:r>
+          </w:p>
+        </w:tc>
+        <w:tc>
+          <w:tcPr/>
+          <w:p>
+            <w:pPr>
+              <w:pStyle w:val="Compact"/>
+              <w:jc w:val="right"/>
+            </w:pPr>
+            <w:r>
+              <w:t xml:space="preserve">5</w:t>
+            </w:r>
+          </w:p>
+        </w:tc>
+        <w:tc>
+          <w:tcPr/>
+          <w:p>
+            <w:pPr>
+              <w:pStyle w:val="Compact"/>
+              <w:jc w:val="right"/>
+            </w:pPr>
+            <w:r>
+              <w:t xml:space="preserve">51</w:t>
+            </w:r>
+          </w:p>
+        </w:tc>
+        <w:tc>
+          <w:tcPr/>
+          <w:p>
+            <w:pPr>
+              <w:pStyle w:val="Compact"/>
+              <w:jc w:val="right"/>
+            </w:pPr>
+            <w:r>
+              <w:t xml:space="preserve">5</w:t>
+            </w:r>
+          </w:p>
+        </w:tc>
+        <w:tc>
+          <w:tcPr/>
+          <w:p>
+            <w:pPr>
+              <w:pStyle w:val="Compact"/>
+              <w:jc w:val="right"/>
+            </w:pPr>
+            <w:r>
+              <w:t xml:space="preserve">5</w:t>
+            </w:r>
+          </w:p>
+        </w:tc>
+      </w:tr>
+      <w:tr>
+        <w:tc>
+          <w:tcPr/>
+          <w:p>
+            <w:pPr>
+              <w:pStyle w:val="Compact"/>
+              <w:jc w:val="left"/>
+            </w:pPr>
+            <w:r>
+              <w:t xml:space="preserve">qol</w:t>
+            </w:r>
+          </w:p>
+        </w:tc>
+        <w:tc>
+          <w:tcPr/>
+          <w:p>
+            <w:pPr>
+              <w:pStyle w:val="Compact"/>
+              <w:jc w:val="right"/>
+            </w:pPr>
+            <w:r>
+              <w:t xml:space="preserve">5</w:t>
+            </w:r>
+          </w:p>
+        </w:tc>
+        <w:tc>
+          <w:tcPr/>
+          <w:p>
+            <w:pPr>
+              <w:pStyle w:val="Compact"/>
+              <w:jc w:val="right"/>
+            </w:pPr>
+            <w:r>
+              <w:t xml:space="preserve">51</w:t>
+            </w:r>
+          </w:p>
+        </w:tc>
+        <w:tc>
+          <w:tcPr/>
+          <w:p>
+            <w:pPr>
+              <w:pStyle w:val="Compact"/>
+              <w:jc w:val="right"/>
+            </w:pPr>
+            <w:r>
               <w:t xml:space="preserve">1</w:t>
             </w:r>
           </w:p>
@@ -6307,130 +6431,6 @@
             </w:pPr>
             <w:r>
               <w:t xml:space="preserve">2</w:t>
-            </w:r>
-          </w:p>
-        </w:tc>
-      </w:tr>
-      <w:tr>
-        <w:tc>
-          <w:tcPr/>
-          <w:p>
-            <w:pPr>
-              <w:pStyle w:val="Compact"/>
-              <w:jc w:val="left"/>
-            </w:pPr>
-            <w:r>
-              <w:t xml:space="preserve">operational</w:t>
-            </w:r>
-          </w:p>
-        </w:tc>
-        <w:tc>
-          <w:tcPr/>
-          <w:p>
-            <w:pPr>
-              <w:pStyle w:val="Compact"/>
-              <w:jc w:val="right"/>
-            </w:pPr>
-            <w:r>
-              <w:t xml:space="preserve">5</w:t>
-            </w:r>
-          </w:p>
-        </w:tc>
-        <w:tc>
-          <w:tcPr/>
-          <w:p>
-            <w:pPr>
-              <w:pStyle w:val="Compact"/>
-              <w:jc w:val="right"/>
-            </w:pPr>
-            <w:r>
-              <w:t xml:space="preserve">51</w:t>
-            </w:r>
-          </w:p>
-        </w:tc>
-        <w:tc>
-          <w:tcPr/>
-          <w:p>
-            <w:pPr>
-              <w:pStyle w:val="Compact"/>
-              <w:jc w:val="right"/>
-            </w:pPr>
-            <w:r>
-              <w:t xml:space="preserve">4</w:t>
-            </w:r>
-          </w:p>
-        </w:tc>
-        <w:tc>
-          <w:tcPr/>
-          <w:p>
-            <w:pPr>
-              <w:pStyle w:val="Compact"/>
-              <w:jc w:val="right"/>
-            </w:pPr>
-            <w:r>
-              <w:t xml:space="preserve">5</w:t>
-            </w:r>
-          </w:p>
-        </w:tc>
-      </w:tr>
-      <w:tr>
-        <w:tc>
-          <w:tcPr/>
-          <w:p>
-            <w:pPr>
-              <w:pStyle w:val="Compact"/>
-              <w:jc w:val="left"/>
-            </w:pPr>
-            <w:r>
-              <w:t xml:space="preserve">professional</w:t>
-            </w:r>
-          </w:p>
-        </w:tc>
-        <w:tc>
-          <w:tcPr/>
-          <w:p>
-            <w:pPr>
-              <w:pStyle w:val="Compact"/>
-              <w:jc w:val="right"/>
-            </w:pPr>
-            <w:r>
-              <w:t xml:space="preserve">5</w:t>
-            </w:r>
-          </w:p>
-        </w:tc>
-        <w:tc>
-          <w:tcPr/>
-          <w:p>
-            <w:pPr>
-              <w:pStyle w:val="Compact"/>
-              <w:jc w:val="right"/>
-            </w:pPr>
-            <w:r>
-              <w:t xml:space="preserve">51</w:t>
-            </w:r>
-          </w:p>
-        </w:tc>
-        <w:tc>
-          <w:tcPr/>
-          <w:p>
-            <w:pPr>
-              <w:pStyle w:val="Compact"/>
-              <w:jc w:val="right"/>
-            </w:pPr>
-            <w:r>
-              <w:t xml:space="preserve">5</w:t>
-            </w:r>
-          </w:p>
-        </w:tc>
-        <w:tc>
-          <w:tcPr/>
-          <w:p>
-            <w:pPr>
-              <w:pStyle w:val="Compact"/>
-              <w:jc w:val="right"/>
-            </w:pPr>
-            <w:r>
-              <w:t xml:space="preserve">5</w:t>
             </w:r>
           </w:p>
         </w:tc>
@@ -6764,7 +6764,171 @@
               <w:jc w:val="left"/>
             </w:pPr>
             <w:r>
-              <w:t xml:space="preserve">lifestyle</w:t>
+              <w:t xml:space="preserve">operational</w:t>
+            </w:r>
+          </w:p>
+        </w:tc>
+        <w:tc>
+          <w:tcPr/>
+          <w:p>
+            <w:pPr>
+              <w:pStyle w:val="Compact"/>
+              <w:jc w:val="right"/>
+            </w:pPr>
+            <w:r>
+              <w:t xml:space="preserve">86.0</w:t>
+            </w:r>
+          </w:p>
+        </w:tc>
+        <w:tc>
+          <w:tcPr/>
+          <w:p>
+            <w:pPr>
+              <w:pStyle w:val="Compact"/>
+              <w:jc w:val="right"/>
+            </w:pPr>
+            <w:r>
+              <w:t xml:space="preserve">0.220</w:t>
+            </w:r>
+          </w:p>
+        </w:tc>
+        <w:tc>
+          <w:tcPr/>
+          <w:p>
+            <w:pPr>
+              <w:pStyle w:val="Compact"/>
+              <w:jc w:val="right"/>
+            </w:pPr>
+            <w:r>
+              <w:t xml:space="preserve">0.330</w:t>
+            </w:r>
+          </w:p>
+        </w:tc>
+        <w:tc>
+          <w:tcPr/>
+          <w:p>
+            <w:pPr>
+              <w:pStyle w:val="Compact"/>
+            </w:pPr>
+          </w:p>
+        </w:tc>
+        <w:tc>
+          <w:tcPr/>
+          <w:p>
+            <w:pPr>
+              <w:pStyle w:val="Compact"/>
+              <w:jc w:val="right"/>
+            </w:pPr>
+            <w:r>
+              <w:t xml:space="preserve">5</w:t>
+            </w:r>
+          </w:p>
+        </w:tc>
+        <w:tc>
+          <w:tcPr/>
+          <w:p>
+            <w:pPr>
+              <w:pStyle w:val="Compact"/>
+              <w:jc w:val="right"/>
+            </w:pPr>
+            <w:r>
+              <w:t xml:space="preserve">51</w:t>
+            </w:r>
+          </w:p>
+        </w:tc>
+      </w:tr>
+      <w:tr>
+        <w:tc>
+          <w:tcPr/>
+          <w:p>
+            <w:pPr>
+              <w:pStyle w:val="Compact"/>
+              <w:jc w:val="left"/>
+            </w:pPr>
+            <w:r>
+              <w:t xml:space="preserve">professional</w:t>
+            </w:r>
+          </w:p>
+        </w:tc>
+        <w:tc>
+          <w:tcPr/>
+          <w:p>
+            <w:pPr>
+              <w:pStyle w:val="Compact"/>
+              <w:jc w:val="right"/>
+            </w:pPr>
+            <w:r>
+              <w:t xml:space="preserve">155.5</w:t>
+            </w:r>
+          </w:p>
+        </w:tc>
+        <w:tc>
+          <w:tcPr/>
+          <w:p>
+            <w:pPr>
+              <w:pStyle w:val="Compact"/>
+              <w:jc w:val="right"/>
+            </w:pPr>
+            <w:r>
+              <w:t xml:space="preserve">0.406</w:t>
+            </w:r>
+          </w:p>
+        </w:tc>
+        <w:tc>
+          <w:tcPr/>
+          <w:p>
+            <w:pPr>
+              <w:pStyle w:val="Compact"/>
+              <w:jc w:val="right"/>
+            </w:pPr>
+            <w:r>
+              <w:t xml:space="preserve">0.487</w:t>
+            </w:r>
+          </w:p>
+        </w:tc>
+        <w:tc>
+          <w:tcPr/>
+          <w:p>
+            <w:pPr>
+              <w:pStyle w:val="Compact"/>
+            </w:pPr>
+          </w:p>
+        </w:tc>
+        <w:tc>
+          <w:tcPr/>
+          <w:p>
+            <w:pPr>
+              <w:pStyle w:val="Compact"/>
+              <w:jc w:val="right"/>
+            </w:pPr>
+            <w:r>
+              <w:t xml:space="preserve">5</w:t>
+            </w:r>
+          </w:p>
+        </w:tc>
+        <w:tc>
+          <w:tcPr/>
+          <w:p>
+            <w:pPr>
+              <w:pStyle w:val="Compact"/>
+              <w:jc w:val="right"/>
+            </w:pPr>
+            <w:r>
+              <w:t xml:space="preserve">51</w:t>
+            </w:r>
+          </w:p>
+        </w:tc>
+      </w:tr>
+      <w:tr>
+        <w:tc>
+          <w:tcPr/>
+          <w:p>
+            <w:pPr>
+              <w:pStyle w:val="Compact"/>
+              <w:jc w:val="left"/>
+            </w:pPr>
+            <w:r>
+              <w:t xml:space="preserve">qol</w:t>
             </w:r>
           </w:p>
         </w:tc>
@@ -6814,170 +6978,6 @@
             <w:r>
               <w:t xml:space="preserve">*</w:t>
             </w:r>
-          </w:p>
-        </w:tc>
-        <w:tc>
-          <w:tcPr/>
-          <w:p>
-            <w:pPr>
-              <w:pStyle w:val="Compact"/>
-              <w:jc w:val="right"/>
-            </w:pPr>
-            <w:r>
-              <w:t xml:space="preserve">5</w:t>
-            </w:r>
-          </w:p>
-        </w:tc>
-        <w:tc>
-          <w:tcPr/>
-          <w:p>
-            <w:pPr>
-              <w:pStyle w:val="Compact"/>
-              <w:jc w:val="right"/>
-            </w:pPr>
-            <w:r>
-              <w:t xml:space="preserve">51</w:t>
-            </w:r>
-          </w:p>
-        </w:tc>
-      </w:tr>
-      <w:tr>
-        <w:tc>
-          <w:tcPr/>
-          <w:p>
-            <w:pPr>
-              <w:pStyle w:val="Compact"/>
-              <w:jc w:val="left"/>
-            </w:pPr>
-            <w:r>
-              <w:t xml:space="preserve">operational</w:t>
-            </w:r>
-          </w:p>
-        </w:tc>
-        <w:tc>
-          <w:tcPr/>
-          <w:p>
-            <w:pPr>
-              <w:pStyle w:val="Compact"/>
-              <w:jc w:val="right"/>
-            </w:pPr>
-            <w:r>
-              <w:t xml:space="preserve">86.0</w:t>
-            </w:r>
-          </w:p>
-        </w:tc>
-        <w:tc>
-          <w:tcPr/>
-          <w:p>
-            <w:pPr>
-              <w:pStyle w:val="Compact"/>
-              <w:jc w:val="right"/>
-            </w:pPr>
-            <w:r>
-              <w:t xml:space="preserve">0.220</w:t>
-            </w:r>
-          </w:p>
-        </w:tc>
-        <w:tc>
-          <w:tcPr/>
-          <w:p>
-            <w:pPr>
-              <w:pStyle w:val="Compact"/>
-              <w:jc w:val="right"/>
-            </w:pPr>
-            <w:r>
-              <w:t xml:space="preserve">0.330</w:t>
-            </w:r>
-          </w:p>
-        </w:tc>
-        <w:tc>
-          <w:tcPr/>
-          <w:p>
-            <w:pPr>
-              <w:pStyle w:val="Compact"/>
-            </w:pPr>
-          </w:p>
-        </w:tc>
-        <w:tc>
-          <w:tcPr/>
-          <w:p>
-            <w:pPr>
-              <w:pStyle w:val="Compact"/>
-              <w:jc w:val="right"/>
-            </w:pPr>
-            <w:r>
-              <w:t xml:space="preserve">5</w:t>
-            </w:r>
-          </w:p>
-        </w:tc>
-        <w:tc>
-          <w:tcPr/>
-          <w:p>
-            <w:pPr>
-              <w:pStyle w:val="Compact"/>
-              <w:jc w:val="right"/>
-            </w:pPr>
-            <w:r>
-              <w:t xml:space="preserve">51</w:t>
-            </w:r>
-          </w:p>
-        </w:tc>
-      </w:tr>
-      <w:tr>
-        <w:tc>
-          <w:tcPr/>
-          <w:p>
-            <w:pPr>
-              <w:pStyle w:val="Compact"/>
-              <w:jc w:val="left"/>
-            </w:pPr>
-            <w:r>
-              <w:t xml:space="preserve">professional</w:t>
-            </w:r>
-          </w:p>
-        </w:tc>
-        <w:tc>
-          <w:tcPr/>
-          <w:p>
-            <w:pPr>
-              <w:pStyle w:val="Compact"/>
-              <w:jc w:val="right"/>
-            </w:pPr>
-            <w:r>
-              <w:t xml:space="preserve">155.5</w:t>
-            </w:r>
-          </w:p>
-        </w:tc>
-        <w:tc>
-          <w:tcPr/>
-          <w:p>
-            <w:pPr>
-              <w:pStyle w:val="Compact"/>
-              <w:jc w:val="right"/>
-            </w:pPr>
-            <w:r>
-              <w:t xml:space="preserve">0.406</w:t>
-            </w:r>
-          </w:p>
-        </w:tc>
-        <w:tc>
-          <w:tcPr/>
-          <w:p>
-            <w:pPr>
-              <w:pStyle w:val="Compact"/>
-              <w:jc w:val="right"/>
-            </w:pPr>
-            <w:r>
-              <w:t xml:space="preserve">0.487</w:t>
-            </w:r>
-          </w:p>
-        </w:tc>
-        <w:tc>
-          <w:tcPr/>
-          <w:p>
-            <w:pPr>
-              <w:pStyle w:val="Compact"/>
-            </w:pPr>
           </w:p>
         </w:tc>
         <w:tc>
@@ -7472,7 +7472,7 @@
               <w:jc w:val="left"/>
             </w:pPr>
             <w:r>
-              <w:t xml:space="preserve">lifestyle</w:t>
+              <w:t xml:space="preserve">operational</w:t>
             </w:r>
           </w:p>
         </w:tc>
@@ -7508,6 +7508,130 @@
               <w:jc w:val="right"/>
             </w:pPr>
             <w:r>
+              <w:t xml:space="preserve">4</w:t>
+            </w:r>
+          </w:p>
+        </w:tc>
+        <w:tc>
+          <w:tcPr/>
+          <w:p>
+            <w:pPr>
+              <w:pStyle w:val="Compact"/>
+              <w:jc w:val="right"/>
+            </w:pPr>
+            <w:r>
+              <w:t xml:space="preserve">5.0</w:t>
+            </w:r>
+          </w:p>
+        </w:tc>
+      </w:tr>
+      <w:tr>
+        <w:tc>
+          <w:tcPr/>
+          <w:p>
+            <w:pPr>
+              <w:pStyle w:val="Compact"/>
+              <w:jc w:val="left"/>
+            </w:pPr>
+            <w:r>
+              <w:t xml:space="preserve">professional</w:t>
+            </w:r>
+          </w:p>
+        </w:tc>
+        <w:tc>
+          <w:tcPr/>
+          <w:p>
+            <w:pPr>
+              <w:pStyle w:val="Compact"/>
+              <w:jc w:val="right"/>
+            </w:pPr>
+            <w:r>
+              <w:t xml:space="preserve">53</w:t>
+            </w:r>
+          </w:p>
+        </w:tc>
+        <w:tc>
+          <w:tcPr/>
+          <w:p>
+            <w:pPr>
+              <w:pStyle w:val="Compact"/>
+              <w:jc w:val="right"/>
+            </w:pPr>
+            <w:r>
+              <w:t xml:space="preserve">4</w:t>
+            </w:r>
+          </w:p>
+        </w:tc>
+        <w:tc>
+          <w:tcPr/>
+          <w:p>
+            <w:pPr>
+              <w:pStyle w:val="Compact"/>
+              <w:jc w:val="right"/>
+            </w:pPr>
+            <w:r>
+              <w:t xml:space="preserve">5</w:t>
+            </w:r>
+          </w:p>
+        </w:tc>
+        <w:tc>
+          <w:tcPr/>
+          <w:p>
+            <w:pPr>
+              <w:pStyle w:val="Compact"/>
+              <w:jc w:val="right"/>
+            </w:pPr>
+            <w:r>
+              <w:t xml:space="preserve">4.0</w:t>
+            </w:r>
+          </w:p>
+        </w:tc>
+      </w:tr>
+      <w:tr>
+        <w:tc>
+          <w:tcPr/>
+          <w:p>
+            <w:pPr>
+              <w:pStyle w:val="Compact"/>
+              <w:jc w:val="left"/>
+            </w:pPr>
+            <w:r>
+              <w:t xml:space="preserve">qol</w:t>
+            </w:r>
+          </w:p>
+        </w:tc>
+        <w:tc>
+          <w:tcPr/>
+          <w:p>
+            <w:pPr>
+              <w:pStyle w:val="Compact"/>
+              <w:jc w:val="right"/>
+            </w:pPr>
+            <w:r>
+              <w:t xml:space="preserve">53</w:t>
+            </w:r>
+          </w:p>
+        </w:tc>
+        <w:tc>
+          <w:tcPr/>
+          <w:p>
+            <w:pPr>
+              <w:pStyle w:val="Compact"/>
+              <w:jc w:val="right"/>
+            </w:pPr>
+            <w:r>
+              <w:t xml:space="preserve">4</w:t>
+            </w:r>
+          </w:p>
+        </w:tc>
+        <w:tc>
+          <w:tcPr/>
+          <w:p>
+            <w:pPr>
+              <w:pStyle w:val="Compact"/>
+              <w:jc w:val="right"/>
+            </w:pPr>
+            <w:r>
               <w:t xml:space="preserve">2</w:t>
             </w:r>
           </w:p>
@@ -7521,130 +7645,6 @@
             </w:pPr>
             <w:r>
               <w:t xml:space="preserve">2.0</w:t>
-            </w:r>
-          </w:p>
-        </w:tc>
-      </w:tr>
-      <w:tr>
-        <w:tc>
-          <w:tcPr/>
-          <w:p>
-            <w:pPr>
-              <w:pStyle w:val="Compact"/>
-              <w:jc w:val="left"/>
-            </w:pPr>
-            <w:r>
-              <w:t xml:space="preserve">operational</w:t>
-            </w:r>
-          </w:p>
-        </w:tc>
-        <w:tc>
-          <w:tcPr/>
-          <w:p>
-            <w:pPr>
-              <w:pStyle w:val="Compact"/>
-              <w:jc w:val="right"/>
-            </w:pPr>
-            <w:r>
-              <w:t xml:space="preserve">53</w:t>
-            </w:r>
-          </w:p>
-        </w:tc>
-        <w:tc>
-          <w:tcPr/>
-          <w:p>
-            <w:pPr>
-              <w:pStyle w:val="Compact"/>
-              <w:jc w:val="right"/>
-            </w:pPr>
-            <w:r>
-              <w:t xml:space="preserve">4</w:t>
-            </w:r>
-          </w:p>
-        </w:tc>
-        <w:tc>
-          <w:tcPr/>
-          <w:p>
-            <w:pPr>
-              <w:pStyle w:val="Compact"/>
-              <w:jc w:val="right"/>
-            </w:pPr>
-            <w:r>
-              <w:t xml:space="preserve">4</w:t>
-            </w:r>
-          </w:p>
-        </w:tc>
-        <w:tc>
-          <w:tcPr/>
-          <w:p>
-            <w:pPr>
-              <w:pStyle w:val="Compact"/>
-              <w:jc w:val="right"/>
-            </w:pPr>
-            <w:r>
-              <w:t xml:space="preserve">5.0</w:t>
-            </w:r>
-          </w:p>
-        </w:tc>
-      </w:tr>
-      <w:tr>
-        <w:tc>
-          <w:tcPr/>
-          <w:p>
-            <w:pPr>
-              <w:pStyle w:val="Compact"/>
-              <w:jc w:val="left"/>
-            </w:pPr>
-            <w:r>
-              <w:t xml:space="preserve">professional</w:t>
-            </w:r>
-          </w:p>
-        </w:tc>
-        <w:tc>
-          <w:tcPr/>
-          <w:p>
-            <w:pPr>
-              <w:pStyle w:val="Compact"/>
-              <w:jc w:val="right"/>
-            </w:pPr>
-            <w:r>
-              <w:t xml:space="preserve">53</w:t>
-            </w:r>
-          </w:p>
-        </w:tc>
-        <w:tc>
-          <w:tcPr/>
-          <w:p>
-            <w:pPr>
-              <w:pStyle w:val="Compact"/>
-              <w:jc w:val="right"/>
-            </w:pPr>
-            <w:r>
-              <w:t xml:space="preserve">4</w:t>
-            </w:r>
-          </w:p>
-        </w:tc>
-        <w:tc>
-          <w:tcPr/>
-          <w:p>
-            <w:pPr>
-              <w:pStyle w:val="Compact"/>
-              <w:jc w:val="right"/>
-            </w:pPr>
-            <w:r>
-              <w:t xml:space="preserve">5</w:t>
-            </w:r>
-          </w:p>
-        </w:tc>
-        <w:tc>
-          <w:tcPr/>
-          <w:p>
-            <w:pPr>
-              <w:pStyle w:val="Compact"/>
-              <w:jc w:val="right"/>
-            </w:pPr>
-            <w:r>
-              <w:t xml:space="preserve">4.0</w:t>
             </w:r>
           </w:p>
         </w:tc>
@@ -7943,7 +7943,7 @@
               <w:jc w:val="left"/>
             </w:pPr>
             <w:r>
-              <w:t xml:space="preserve">lifestyle</w:t>
+              <w:t xml:space="preserve">operational</w:t>
             </w:r>
           </w:p>
         </w:tc>
@@ -7979,6 +7979,130 @@
               <w:jc w:val="right"/>
             </w:pPr>
             <w:r>
+              <w:t xml:space="preserve">5</w:t>
+            </w:r>
+          </w:p>
+        </w:tc>
+        <w:tc>
+          <w:tcPr/>
+          <w:p>
+            <w:pPr>
+              <w:pStyle w:val="Compact"/>
+              <w:jc w:val="right"/>
+            </w:pPr>
+            <w:r>
+              <w:t xml:space="preserve">4</w:t>
+            </w:r>
+          </w:p>
+        </w:tc>
+      </w:tr>
+      <w:tr>
+        <w:tc>
+          <w:tcPr/>
+          <w:p>
+            <w:pPr>
+              <w:pStyle w:val="Compact"/>
+              <w:jc w:val="left"/>
+            </w:pPr>
+            <w:r>
+              <w:t xml:space="preserve">professional</w:t>
+            </w:r>
+          </w:p>
+        </w:tc>
+        <w:tc>
+          <w:tcPr/>
+          <w:p>
+            <w:pPr>
+              <w:pStyle w:val="Compact"/>
+              <w:jc w:val="right"/>
+            </w:pPr>
+            <w:r>
+              <w:t xml:space="preserve">21</w:t>
+            </w:r>
+          </w:p>
+        </w:tc>
+        <w:tc>
+          <w:tcPr/>
+          <w:p>
+            <w:pPr>
+              <w:pStyle w:val="Compact"/>
+              <w:jc w:val="right"/>
+            </w:pPr>
+            <w:r>
+              <w:t xml:space="preserve">36</w:t>
+            </w:r>
+          </w:p>
+        </w:tc>
+        <w:tc>
+          <w:tcPr/>
+          <w:p>
+            <w:pPr>
+              <w:pStyle w:val="Compact"/>
+              <w:jc w:val="right"/>
+            </w:pPr>
+            <w:r>
+              <w:t xml:space="preserve">4</w:t>
+            </w:r>
+          </w:p>
+        </w:tc>
+        <w:tc>
+          <w:tcPr/>
+          <w:p>
+            <w:pPr>
+              <w:pStyle w:val="Compact"/>
+              <w:jc w:val="right"/>
+            </w:pPr>
+            <w:r>
+              <w:t xml:space="preserve">5</w:t>
+            </w:r>
+          </w:p>
+        </w:tc>
+      </w:tr>
+      <w:tr>
+        <w:tc>
+          <w:tcPr/>
+          <w:p>
+            <w:pPr>
+              <w:pStyle w:val="Compact"/>
+              <w:jc w:val="left"/>
+            </w:pPr>
+            <w:r>
+              <w:t xml:space="preserve">qol</w:t>
+            </w:r>
+          </w:p>
+        </w:tc>
+        <w:tc>
+          <w:tcPr/>
+          <w:p>
+            <w:pPr>
+              <w:pStyle w:val="Compact"/>
+              <w:jc w:val="right"/>
+            </w:pPr>
+            <w:r>
+              <w:t xml:space="preserve">21</w:t>
+            </w:r>
+          </w:p>
+        </w:tc>
+        <w:tc>
+          <w:tcPr/>
+          <w:p>
+            <w:pPr>
+              <w:pStyle w:val="Compact"/>
+              <w:jc w:val="right"/>
+            </w:pPr>
+            <w:r>
+              <w:t xml:space="preserve">36</w:t>
+            </w:r>
+          </w:p>
+        </w:tc>
+        <w:tc>
+          <w:tcPr/>
+          <w:p>
+            <w:pPr>
+              <w:pStyle w:val="Compact"/>
+              <w:jc w:val="right"/>
+            </w:pPr>
+            <w:r>
               <w:t xml:space="preserve">2</w:t>
             </w:r>
           </w:p>
@@ -7992,130 +8116,6 @@
             </w:pPr>
             <w:r>
               <w:t xml:space="preserve">2</w:t>
-            </w:r>
-          </w:p>
-        </w:tc>
-      </w:tr>
-      <w:tr>
-        <w:tc>
-          <w:tcPr/>
-          <w:p>
-            <w:pPr>
-              <w:pStyle w:val="Compact"/>
-              <w:jc w:val="left"/>
-            </w:pPr>
-            <w:r>
-              <w:t xml:space="preserve">operational</w:t>
-            </w:r>
-          </w:p>
-        </w:tc>
-        <w:tc>
-          <w:tcPr/>
-          <w:p>
-            <w:pPr>
-              <w:pStyle w:val="Compact"/>
-              <w:jc w:val="right"/>
-            </w:pPr>
-            <w:r>
-              <w:t xml:space="preserve">21</w:t>
-            </w:r>
-          </w:p>
-        </w:tc>
-        <w:tc>
-          <w:tcPr/>
-          <w:p>
-            <w:pPr>
-              <w:pStyle w:val="Compact"/>
-              <w:jc w:val="right"/>
-            </w:pPr>
-            <w:r>
-              <w:t xml:space="preserve">36</w:t>
-            </w:r>
-          </w:p>
-        </w:tc>
-        <w:tc>
-          <w:tcPr/>
-          <w:p>
-            <w:pPr>
-              <w:pStyle w:val="Compact"/>
-              <w:jc w:val="right"/>
-            </w:pPr>
-            <w:r>
-              <w:t xml:space="preserve">5</w:t>
-            </w:r>
-          </w:p>
-        </w:tc>
-        <w:tc>
-          <w:tcPr/>
-          <w:p>
-            <w:pPr>
-              <w:pStyle w:val="Compact"/>
-              <w:jc w:val="right"/>
-            </w:pPr>
-            <w:r>
-              <w:t xml:space="preserve">4</w:t>
-            </w:r>
-          </w:p>
-        </w:tc>
-      </w:tr>
-      <w:tr>
-        <w:tc>
-          <w:tcPr/>
-          <w:p>
-            <w:pPr>
-              <w:pStyle w:val="Compact"/>
-              <w:jc w:val="left"/>
-            </w:pPr>
-            <w:r>
-              <w:t xml:space="preserve">professional</w:t>
-            </w:r>
-          </w:p>
-        </w:tc>
-        <w:tc>
-          <w:tcPr/>
-          <w:p>
-            <w:pPr>
-              <w:pStyle w:val="Compact"/>
-              <w:jc w:val="right"/>
-            </w:pPr>
-            <w:r>
-              <w:t xml:space="preserve">21</w:t>
-            </w:r>
-          </w:p>
-        </w:tc>
-        <w:tc>
-          <w:tcPr/>
-          <w:p>
-            <w:pPr>
-              <w:pStyle w:val="Compact"/>
-              <w:jc w:val="right"/>
-            </w:pPr>
-            <w:r>
-              <w:t xml:space="preserve">36</w:t>
-            </w:r>
-          </w:p>
-        </w:tc>
-        <w:tc>
-          <w:tcPr/>
-          <w:p>
-            <w:pPr>
-              <w:pStyle w:val="Compact"/>
-              <w:jc w:val="right"/>
-            </w:pPr>
-            <w:r>
-              <w:t xml:space="preserve">4</w:t>
-            </w:r>
-          </w:p>
-        </w:tc>
-        <w:tc>
-          <w:tcPr/>
-          <w:p>
-            <w:pPr>
-              <w:pStyle w:val="Compact"/>
-              <w:jc w:val="right"/>
-            </w:pPr>
-            <w:r>
-              <w:t xml:space="preserve">5</w:t>
             </w:r>
           </w:p>
         </w:tc>
@@ -8449,7 +8449,171 @@
               <w:jc w:val="left"/>
             </w:pPr>
             <w:r>
-              <w:t xml:space="preserve">lifestyle</w:t>
+              <w:t xml:space="preserve">operational</w:t>
+            </w:r>
+          </w:p>
+        </w:tc>
+        <w:tc>
+          <w:tcPr/>
+          <w:p>
+            <w:pPr>
+              <w:pStyle w:val="Compact"/>
+              <w:jc w:val="right"/>
+            </w:pPr>
+            <w:r>
+              <w:t xml:space="preserve">497.5</w:t>
+            </w:r>
+          </w:p>
+        </w:tc>
+        <w:tc>
+          <w:tcPr/>
+          <w:p>
+            <w:pPr>
+              <w:pStyle w:val="Compact"/>
+              <w:jc w:val="right"/>
+            </w:pPr>
+            <w:r>
+              <w:t xml:space="preserve">0.040</w:t>
+            </w:r>
+          </w:p>
+        </w:tc>
+        <w:tc>
+          <w:tcPr/>
+          <w:p>
+            <w:pPr>
+              <w:pStyle w:val="Compact"/>
+              <w:jc w:val="right"/>
+            </w:pPr>
+            <w:r>
+              <w:t xml:space="preserve">0.240</w:t>
+            </w:r>
+          </w:p>
+        </w:tc>
+        <w:tc>
+          <w:tcPr/>
+          <w:p>
+            <w:pPr>
+              <w:pStyle w:val="Compact"/>
+            </w:pPr>
+          </w:p>
+        </w:tc>
+        <w:tc>
+          <w:tcPr/>
+          <w:p>
+            <w:pPr>
+              <w:pStyle w:val="Compact"/>
+              <w:jc w:val="right"/>
+            </w:pPr>
+            <w:r>
+              <w:t xml:space="preserve">21</w:t>
+            </w:r>
+          </w:p>
+        </w:tc>
+        <w:tc>
+          <w:tcPr/>
+          <w:p>
+            <w:pPr>
+              <w:pStyle w:val="Compact"/>
+              <w:jc w:val="right"/>
+            </w:pPr>
+            <w:r>
+              <w:t xml:space="preserve">36</w:t>
+            </w:r>
+          </w:p>
+        </w:tc>
+      </w:tr>
+      <w:tr>
+        <w:tc>
+          <w:tcPr/>
+          <w:p>
+            <w:pPr>
+              <w:pStyle w:val="Compact"/>
+              <w:jc w:val="left"/>
+            </w:pPr>
+            <w:r>
+              <w:t xml:space="preserve">professional</w:t>
+            </w:r>
+          </w:p>
+        </w:tc>
+        <w:tc>
+          <w:tcPr/>
+          <w:p>
+            <w:pPr>
+              <w:pStyle w:val="Compact"/>
+              <w:jc w:val="right"/>
+            </w:pPr>
+            <w:r>
+              <w:t xml:space="preserve">334.5</w:t>
+            </w:r>
+          </w:p>
+        </w:tc>
+        <w:tc>
+          <w:tcPr/>
+          <w:p>
+            <w:pPr>
+              <w:pStyle w:val="Compact"/>
+              <w:jc w:val="right"/>
+            </w:pPr>
+            <w:r>
+              <w:t xml:space="preserve">0.453</w:t>
+            </w:r>
+          </w:p>
+        </w:tc>
+        <w:tc>
+          <w:tcPr/>
+          <w:p>
+            <w:pPr>
+              <w:pStyle w:val="Compact"/>
+              <w:jc w:val="right"/>
+            </w:pPr>
+            <w:r>
+              <w:t xml:space="preserve">0.655</w:t>
+            </w:r>
+          </w:p>
+        </w:tc>
+        <w:tc>
+          <w:tcPr/>
+          <w:p>
+            <w:pPr>
+              <w:pStyle w:val="Compact"/>
+            </w:pPr>
+          </w:p>
+        </w:tc>
+        <w:tc>
+          <w:tcPr/>
+          <w:p>
+            <w:pPr>
+              <w:pStyle w:val="Compact"/>
+              <w:jc w:val="right"/>
+            </w:pPr>
+            <w:r>
+              <w:t xml:space="preserve">21</w:t>
+            </w:r>
+          </w:p>
+        </w:tc>
+        <w:tc>
+          <w:tcPr/>
+          <w:p>
+            <w:pPr>
+              <w:pStyle w:val="Compact"/>
+              <w:jc w:val="right"/>
+            </w:pPr>
+            <w:r>
+              <w:t xml:space="preserve">36</w:t>
+            </w:r>
+          </w:p>
+        </w:tc>
+      </w:tr>
+      <w:tr>
+        <w:tc>
+          <w:tcPr/>
+          <w:p>
+            <w:pPr>
+              <w:pStyle w:val="Compact"/>
+              <w:jc w:val="left"/>
+            </w:pPr>
+            <w:r>
+              <w:t xml:space="preserve">qol</w:t>
             </w:r>
           </w:p>
         </w:tc>
@@ -8474,170 +8638,6 @@
             </w:pPr>
             <w:r>
               <w:t xml:space="preserve">0.546</w:t>
-            </w:r>
-          </w:p>
-        </w:tc>
-        <w:tc>
-          <w:tcPr/>
-          <w:p>
-            <w:pPr>
-              <w:pStyle w:val="Compact"/>
-              <w:jc w:val="right"/>
-            </w:pPr>
-            <w:r>
-              <w:t xml:space="preserve">0.655</w:t>
-            </w:r>
-          </w:p>
-        </w:tc>
-        <w:tc>
-          <w:tcPr/>
-          <w:p>
-            <w:pPr>
-              <w:pStyle w:val="Compact"/>
-            </w:pPr>
-          </w:p>
-        </w:tc>
-        <w:tc>
-          <w:tcPr/>
-          <w:p>
-            <w:pPr>
-              <w:pStyle w:val="Compact"/>
-              <w:jc w:val="right"/>
-            </w:pPr>
-            <w:r>
-              <w:t xml:space="preserve">21</w:t>
-            </w:r>
-          </w:p>
-        </w:tc>
-        <w:tc>
-          <w:tcPr/>
-          <w:p>
-            <w:pPr>
-              <w:pStyle w:val="Compact"/>
-              <w:jc w:val="right"/>
-            </w:pPr>
-            <w:r>
-              <w:t xml:space="preserve">36</w:t>
-            </w:r>
-          </w:p>
-        </w:tc>
-      </w:tr>
-      <w:tr>
-        <w:tc>
-          <w:tcPr/>
-          <w:p>
-            <w:pPr>
-              <w:pStyle w:val="Compact"/>
-              <w:jc w:val="left"/>
-            </w:pPr>
-            <w:r>
-              <w:t xml:space="preserve">operational</w:t>
-            </w:r>
-          </w:p>
-        </w:tc>
-        <w:tc>
-          <w:tcPr/>
-          <w:p>
-            <w:pPr>
-              <w:pStyle w:val="Compact"/>
-              <w:jc w:val="right"/>
-            </w:pPr>
-            <w:r>
-              <w:t xml:space="preserve">497.5</w:t>
-            </w:r>
-          </w:p>
-        </w:tc>
-        <w:tc>
-          <w:tcPr/>
-          <w:p>
-            <w:pPr>
-              <w:pStyle w:val="Compact"/>
-              <w:jc w:val="right"/>
-            </w:pPr>
-            <w:r>
-              <w:t xml:space="preserve">0.040</w:t>
-            </w:r>
-          </w:p>
-        </w:tc>
-        <w:tc>
-          <w:tcPr/>
-          <w:p>
-            <w:pPr>
-              <w:pStyle w:val="Compact"/>
-              <w:jc w:val="right"/>
-            </w:pPr>
-            <w:r>
-              <w:t xml:space="preserve">0.240</w:t>
-            </w:r>
-          </w:p>
-        </w:tc>
-        <w:tc>
-          <w:tcPr/>
-          <w:p>
-            <w:pPr>
-              <w:pStyle w:val="Compact"/>
-            </w:pPr>
-          </w:p>
-        </w:tc>
-        <w:tc>
-          <w:tcPr/>
-          <w:p>
-            <w:pPr>
-              <w:pStyle w:val="Compact"/>
-              <w:jc w:val="right"/>
-            </w:pPr>
-            <w:r>
-              <w:t xml:space="preserve">21</w:t>
-            </w:r>
-          </w:p>
-        </w:tc>
-        <w:tc>
-          <w:tcPr/>
-          <w:p>
-            <w:pPr>
-              <w:pStyle w:val="Compact"/>
-              <w:jc w:val="right"/>
-            </w:pPr>
-            <w:r>
-              <w:t xml:space="preserve">36</w:t>
-            </w:r>
-          </w:p>
-        </w:tc>
-      </w:tr>
-      <w:tr>
-        <w:tc>
-          <w:tcPr/>
-          <w:p>
-            <w:pPr>
-              <w:pStyle w:val="Compact"/>
-              <w:jc w:val="left"/>
-            </w:pPr>
-            <w:r>
-              <w:t xml:space="preserve">professional</w:t>
-            </w:r>
-          </w:p>
-        </w:tc>
-        <w:tc>
-          <w:tcPr/>
-          <w:p>
-            <w:pPr>
-              <w:pStyle w:val="Compact"/>
-              <w:jc w:val="right"/>
-            </w:pPr>
-            <w:r>
-              <w:t xml:space="preserve">334.5</w:t>
-            </w:r>
-          </w:p>
-        </w:tc>
-        <w:tc>
-          <w:tcPr/>
-          <w:p>
-            <w:pPr>
-              <w:pStyle w:val="Compact"/>
-              <w:jc w:val="right"/>
-            </w:pPr>
-            <w:r>
-              <w:t xml:space="preserve">0.453</w:t>
             </w:r>
           </w:p>
         </w:tc>

</xml_diff>